<commit_message>
Update to F26 Calendar
</commit_message>
<xml_diff>
--- a/calendars/F26-Stat216_Calendar.docx
+++ b/calendars/F26-Stat216_Calendar.docx
@@ -941,7 +941,7 @@
                 <w:sz w:val="24"/>
                 <w:szCs w:val="24"/>
               </w:rPr>
-              <w:t xml:space="preserve">: </w:t>
+              <w:t>:</w:t>
             </w:r>
             <w:r>
               <w:rPr>
@@ -951,7 +951,7 @@
                 <w:sz w:val="24"/>
                 <w:szCs w:val="24"/>
               </w:rPr>
-              <w:t>Sampling Methods</w:t>
+              <w:t xml:space="preserve"> Intro to Data Analysis and Sampling Bias</w:t>
             </w:r>
           </w:p>
         </w:tc>
@@ -2950,7 +2950,7 @@
                 <w:sz w:val="24"/>
                 <w:szCs w:val="24"/>
               </w:rPr>
-              <w:t>Module 3 and 4 Lab</w:t>
+              <w:t>Activity 9: Impacts on p-value and Confidence Intervals</w:t>
             </w:r>
           </w:p>
         </w:tc>
@@ -2967,28 +2967,11 @@
           <w:p>
             <w:pPr>
               <w:rPr>
-                <w:rFonts w:ascii="Times New Roman" w:eastAsia="Times New Roman" w:hAnsi="Times New Roman" w:cs="Times New Roman"/>
-                <w:sz w:val="24"/>
-                <w:szCs w:val="24"/>
-              </w:rPr>
-            </w:pPr>
-          </w:p>
-          <w:p>
-            <w:pPr>
-              <w:rPr>
-                <w:rFonts w:ascii="Times New Roman" w:hAnsi="Times New Roman" w:cs="Times New Roman"/>
-                <w:sz w:val="24"/>
-                <w:szCs w:val="24"/>
-              </w:rPr>
-            </w:pPr>
-            <w:r>
-              <w:rPr>
-                <w:rFonts w:ascii="Times New Roman" w:eastAsia="Times New Roman" w:hAnsi="Times New Roman" w:cs="Times New Roman"/>
-                <w:sz w:val="24"/>
-                <w:szCs w:val="24"/>
-              </w:rPr>
-              <w:t xml:space="preserve"> </w:t>
-            </w:r>
+                <w:rFonts w:ascii="Times New Roman" w:hAnsi="Times New Roman" w:cs="Times New Roman"/>
+                <w:sz w:val="24"/>
+                <w:szCs w:val="24"/>
+              </w:rPr>
+            </w:pPr>
           </w:p>
         </w:tc>
         <w:tc>
@@ -3001,25 +2984,6 @@
               <w:right w:val="single" w:sz="4" w:space="0" w:color="000000"/>
             </w:tcBorders>
           </w:tcPr>
-          <w:p>
-            <w:pPr>
-              <w:rPr>
-                <w:rFonts w:ascii="Times New Roman" w:hAnsi="Times New Roman" w:cs="Times New Roman"/>
-                <w:color w:val="4472C4" w:themeColor="accent5"/>
-                <w:sz w:val="24"/>
-                <w:szCs w:val="24"/>
-              </w:rPr>
-            </w:pPr>
-            <w:r>
-              <w:rPr>
-                <w:rFonts w:ascii="Times New Roman" w:hAnsi="Times New Roman" w:cs="Times New Roman"/>
-                <w:color w:val="4472C4" w:themeColor="accent5"/>
-                <w:sz w:val="24"/>
-                <w:szCs w:val="24"/>
-              </w:rPr>
-              <w:t>Module 3 and 4 Lab</w:t>
-            </w:r>
-          </w:p>
           <w:p>
             <w:pPr>
               <w:rPr>
@@ -3086,19 +3050,11 @@
             </w:pPr>
             <w:r>
               <w:rPr>
-                <w:rFonts w:ascii="Times New Roman" w:eastAsia="Times New Roman" w:hAnsi="Times New Roman" w:cs="Times New Roman"/>
-                <w:sz w:val="24"/>
-                <w:szCs w:val="24"/>
-              </w:rPr>
-              <w:t>Mon 9/</w:t>
-            </w:r>
-            <w:r>
-              <w:rPr>
-                <w:rFonts w:ascii="Times New Roman" w:eastAsia="Times New Roman" w:hAnsi="Times New Roman" w:cs="Times New Roman"/>
-                <w:sz w:val="24"/>
-                <w:szCs w:val="24"/>
-              </w:rPr>
-              <w:t>21</w:t>
+                <w:rFonts w:ascii="Times New Roman" w:hAnsi="Times New Roman" w:cs="Times New Roman"/>
+                <w:sz w:val="24"/>
+                <w:szCs w:val="24"/>
+              </w:rPr>
+              <w:t>Mon 9/21</w:t>
             </w:r>
           </w:p>
         </w:tc>
@@ -3127,7 +3083,7 @@
                 <w:sz w:val="24"/>
                 <w:szCs w:val="24"/>
               </w:rPr>
-              <w:t>Exam 1 Review</w:t>
+              <w:t>Module 3 and 4 Lab</w:t>
             </w:r>
           </w:p>
         </w:tc>
@@ -3174,11 +3130,20 @@
             <w:r>
               <w:rPr>
                 <w:rFonts w:ascii="Times New Roman" w:hAnsi="Times New Roman" w:cs="Times New Roman"/>
+                <w:color w:val="4472C4" w:themeColor="accent5"/>
+                <w:sz w:val="24"/>
+                <w:szCs w:val="24"/>
+              </w:rPr>
+              <w:t>Module 3 and 4 Lab</w:t>
+            </w:r>
+            <w:r>
+              <w:rPr>
+                <w:rFonts w:ascii="Times New Roman" w:hAnsi="Times New Roman" w:cs="Times New Roman"/>
                 <w:color w:val="00B050"/>
                 <w:sz w:val="24"/>
                 <w:szCs w:val="24"/>
               </w:rPr>
-              <w:t xml:space="preserve">Assignment </w:t>
+              <w:t xml:space="preserve"> Assignment </w:t>
             </w:r>
             <w:r>
               <w:rPr>
@@ -3252,15 +3217,7 @@
                 <w:sz w:val="24"/>
                 <w:szCs w:val="24"/>
               </w:rPr>
-              <w:t>Wed 9/</w:t>
-            </w:r>
-            <w:r>
-              <w:rPr>
-                <w:rFonts w:ascii="Times New Roman" w:hAnsi="Times New Roman" w:cs="Times New Roman"/>
-                <w:sz w:val="24"/>
-                <w:szCs w:val="24"/>
-              </w:rPr>
-              <w:t>23</w:t>
+              <w:t>Wed 9/23</w:t>
             </w:r>
           </w:p>
         </w:tc>
@@ -3287,15 +3244,11 @@
             </w:pPr>
             <w:r>
               <w:rPr>
-                <w:rFonts w:ascii="Times New Roman" w:eastAsia="Times New Roman" w:hAnsi="Times New Roman" w:cs="Times New Roman"/>
-                <w:b/>
-                <w:bCs/>
-                <w:color w:val="auto"/>
-                <w:sz w:val="24"/>
-                <w:szCs w:val="24"/>
-                <w:highlight w:val="yellow"/>
-              </w:rPr>
-              <w:t>Group Midterm Exam 1</w:t>
+                <w:rFonts w:ascii="Times New Roman" w:hAnsi="Times New Roman" w:cs="Times New Roman"/>
+                <w:sz w:val="24"/>
+                <w:szCs w:val="24"/>
+              </w:rPr>
+              <w:t>Exam 1 Review</w:t>
             </w:r>
           </w:p>
         </w:tc>
@@ -3407,15 +3360,7 @@
                 <w:sz w:val="24"/>
                 <w:szCs w:val="24"/>
               </w:rPr>
-              <w:t>Fri 9/</w:t>
-            </w:r>
-            <w:r>
-              <w:rPr>
-                <w:rFonts w:ascii="Times New Roman" w:hAnsi="Times New Roman" w:cs="Times New Roman"/>
-                <w:sz w:val="24"/>
-                <w:szCs w:val="24"/>
-              </w:rPr>
-              <w:t>25</w:t>
+              <w:t>Fri 9/25</w:t>
             </w:r>
           </w:p>
         </w:tc>
@@ -3442,24 +3387,15 @@
             </w:pPr>
             <w:r>
               <w:rPr>
-                <w:rFonts w:ascii="Times New Roman" w:hAnsi="Times New Roman" w:cs="Times New Roman"/>
+                <w:rFonts w:ascii="Times New Roman" w:eastAsia="Times New Roman" w:hAnsi="Times New Roman" w:cs="Times New Roman"/>
                 <w:b/>
                 <w:bCs/>
+                <w:color w:val="auto"/>
                 <w:sz w:val="24"/>
                 <w:szCs w:val="24"/>
                 <w:highlight w:val="yellow"/>
               </w:rPr>
-              <w:t xml:space="preserve">Individual Midterm Exam </w:t>
-            </w:r>
-            <w:r>
-              <w:rPr>
-                <w:rFonts w:ascii="Times New Roman" w:hAnsi="Times New Roman" w:cs="Times New Roman"/>
-                <w:b/>
-                <w:bCs/>
-                <w:sz w:val="24"/>
-                <w:szCs w:val="24"/>
-              </w:rPr>
-              <w:t>1</w:t>
+              <w:t>Group Midterm Exam 1</w:t>
             </w:r>
           </w:p>
         </w:tc>
@@ -3567,15 +3503,7 @@
                 <w:sz w:val="24"/>
                 <w:szCs w:val="24"/>
               </w:rPr>
-              <w:t>Mon 9/2</w:t>
-            </w:r>
-            <w:r>
-              <w:rPr>
-                <w:rFonts w:ascii="Times New Roman" w:hAnsi="Times New Roman" w:cs="Times New Roman"/>
-                <w:sz w:val="24"/>
-                <w:szCs w:val="24"/>
-              </w:rPr>
-              <w:t>8</w:t>
+              <w:t>Mon 9/28</w:t>
             </w:r>
           </w:p>
         </w:tc>
@@ -3600,29 +3528,23 @@
             <w:r>
               <w:rPr>
                 <w:rFonts w:ascii="Times New Roman" w:hAnsi="Times New Roman" w:cs="Times New Roman"/>
-                <w:color w:val="auto"/>
-                <w:sz w:val="24"/>
-                <w:szCs w:val="24"/>
-              </w:rPr>
-              <w:t xml:space="preserve">Activity </w:t>
-            </w:r>
-            <w:r>
-              <w:rPr>
-                <w:rFonts w:ascii="Times New Roman" w:hAnsi="Times New Roman" w:cs="Times New Roman"/>
-                <w:color w:val="auto"/>
-                <w:sz w:val="24"/>
-                <w:szCs w:val="24"/>
-              </w:rPr>
-              <w:t>9</w:t>
-            </w:r>
-            <w:r>
-              <w:rPr>
-                <w:rFonts w:ascii="Times New Roman" w:hAnsi="Times New Roman" w:cs="Times New Roman"/>
-                <w:color w:val="auto"/>
-                <w:sz w:val="24"/>
-                <w:szCs w:val="24"/>
-              </w:rPr>
-              <w:t>: Summarizing Quantitative Variables</w:t>
+                <w:b/>
+                <w:bCs/>
+                <w:sz w:val="24"/>
+                <w:szCs w:val="24"/>
+                <w:highlight w:val="yellow"/>
+              </w:rPr>
+              <w:t xml:space="preserve">Individual Midterm Exam </w:t>
+            </w:r>
+            <w:r>
+              <w:rPr>
+                <w:rFonts w:ascii="Times New Roman" w:hAnsi="Times New Roman" w:cs="Times New Roman"/>
+                <w:b/>
+                <w:bCs/>
+                <w:sz w:val="24"/>
+                <w:szCs w:val="24"/>
+              </w:rPr>
+              <w:t>1</w:t>
             </w:r>
           </w:p>
         </w:tc>
@@ -3639,244 +3561,11 @@
           <w:p>
             <w:pPr>
               <w:rPr>
-                <w:rFonts w:ascii="Times New Roman" w:eastAsia="Times New Roman" w:hAnsi="Times New Roman" w:cs="Times New Roman"/>
-                <w:color w:val="FF0000"/>
-                <w:sz w:val="24"/>
-              </w:rPr>
-            </w:pPr>
-            <w:r>
-              <w:rPr>
-                <w:rFonts w:ascii="Times New Roman" w:eastAsia="Times New Roman" w:hAnsi="Times New Roman" w:cs="Times New Roman"/>
-                <w:color w:val="FF0000"/>
-                <w:sz w:val="24"/>
-              </w:rPr>
-              <w:t>§</w:t>
-            </w:r>
-            <w:r>
-              <w:rPr>
-                <w:rFonts w:ascii="Times New Roman" w:hAnsi="Times New Roman" w:cs="Times New Roman"/>
-                <w:color w:val="FF0000"/>
-                <w:sz w:val="24"/>
-              </w:rPr>
-              <w:t>5</w:t>
-            </w:r>
-            <w:r>
-              <w:rPr>
-                <w:rFonts w:ascii="Times New Roman" w:hAnsi="Times New Roman" w:cs="Times New Roman"/>
-                <w:color w:val="FF0000"/>
-                <w:sz w:val="24"/>
-              </w:rPr>
-              <w:t>.2</w:t>
-            </w:r>
-            <w:r>
-              <w:rPr>
-                <w:rFonts w:ascii="Times New Roman" w:hAnsi="Times New Roman" w:cs="Times New Roman"/>
-                <w:color w:val="FF0000"/>
-                <w:sz w:val="24"/>
-                <w:szCs w:val="24"/>
-              </w:rPr>
-              <w:t xml:space="preserve">; </w:t>
-            </w:r>
-            <w:r>
-              <w:rPr>
-                <w:rFonts w:ascii="Times New Roman" w:eastAsia="Times New Roman" w:hAnsi="Times New Roman" w:cs="Times New Roman"/>
-                <w:color w:val="FF0000"/>
-                <w:sz w:val="24"/>
-              </w:rPr>
-              <w:t>§</w:t>
-            </w:r>
-            <w:r>
-              <w:rPr>
-                <w:rFonts w:ascii="Times New Roman" w:eastAsia="Times New Roman" w:hAnsi="Times New Roman" w:cs="Times New Roman"/>
-                <w:color w:val="FF0000"/>
-                <w:sz w:val="24"/>
-              </w:rPr>
-              <w:t>5</w:t>
-            </w:r>
-            <w:r>
-              <w:rPr>
-                <w:rFonts w:ascii="Times New Roman" w:eastAsia="Times New Roman" w:hAnsi="Times New Roman" w:cs="Times New Roman"/>
-                <w:color w:val="FF0000"/>
-                <w:sz w:val="24"/>
-              </w:rPr>
-              <w:t>.3</w:t>
-            </w:r>
-            <w:r>
-              <w:rPr>
-                <w:rFonts w:ascii="Times New Roman" w:hAnsi="Times New Roman" w:cs="Times New Roman"/>
-                <w:color w:val="FF0000"/>
-                <w:sz w:val="24"/>
-                <w:szCs w:val="24"/>
-              </w:rPr>
-              <w:t xml:space="preserve">; </w:t>
-            </w:r>
-            <w:r>
-              <w:rPr>
-                <w:rFonts w:ascii="Times New Roman" w:eastAsia="Times New Roman" w:hAnsi="Times New Roman" w:cs="Times New Roman"/>
-                <w:color w:val="FF0000"/>
-                <w:sz w:val="24"/>
-              </w:rPr>
-              <w:t>§</w:t>
-            </w:r>
-            <w:r>
-              <w:rPr>
-                <w:rFonts w:ascii="Times New Roman" w:eastAsia="Times New Roman" w:hAnsi="Times New Roman" w:cs="Times New Roman"/>
-                <w:color w:val="FF0000"/>
-                <w:sz w:val="24"/>
-              </w:rPr>
-              <w:t>5</w:t>
-            </w:r>
-            <w:r>
-              <w:rPr>
-                <w:rFonts w:ascii="Times New Roman" w:eastAsia="Times New Roman" w:hAnsi="Times New Roman" w:cs="Times New Roman"/>
-                <w:color w:val="FF0000"/>
-                <w:sz w:val="24"/>
-              </w:rPr>
-              <w:t>.4</w:t>
-            </w:r>
-            <w:r>
-              <w:rPr>
-                <w:rFonts w:ascii="Times New Roman" w:eastAsia="Times New Roman" w:hAnsi="Times New Roman" w:cs="Times New Roman"/>
-                <w:color w:val="FF0000"/>
-                <w:sz w:val="24"/>
-              </w:rPr>
-              <w:t xml:space="preserve">; </w:t>
-            </w:r>
-            <w:r>
-              <w:rPr>
-                <w:rFonts w:ascii="Times New Roman" w:eastAsia="Times New Roman" w:hAnsi="Times New Roman" w:cs="Times New Roman"/>
-                <w:color w:val="FF0000"/>
-                <w:sz w:val="24"/>
-              </w:rPr>
-              <w:t>§</w:t>
-            </w:r>
-            <w:r>
-              <w:rPr>
-                <w:rFonts w:ascii="Times New Roman" w:hAnsi="Times New Roman" w:cs="Times New Roman"/>
-                <w:color w:val="FF0000"/>
-                <w:sz w:val="24"/>
-              </w:rPr>
-              <w:t>5.5</w:t>
-            </w:r>
-            <w:r>
-              <w:rPr>
-                <w:rFonts w:ascii="Times New Roman" w:hAnsi="Times New Roman" w:cs="Times New Roman"/>
-                <w:color w:val="FF0000"/>
-                <w:sz w:val="24"/>
-                <w:szCs w:val="24"/>
-              </w:rPr>
-              <w:t xml:space="preserve">; </w:t>
-            </w:r>
-            <w:r>
-              <w:rPr>
-                <w:rFonts w:ascii="Times New Roman" w:eastAsia="Times New Roman" w:hAnsi="Times New Roman" w:cs="Times New Roman"/>
-                <w:color w:val="FF0000"/>
-                <w:sz w:val="24"/>
-              </w:rPr>
-              <w:t>§</w:t>
-            </w:r>
-            <w:r>
-              <w:rPr>
-                <w:rFonts w:ascii="Times New Roman" w:eastAsia="Times New Roman" w:hAnsi="Times New Roman" w:cs="Times New Roman"/>
-                <w:color w:val="FF0000"/>
-                <w:sz w:val="24"/>
-              </w:rPr>
-              <w:t>5.7</w:t>
-            </w:r>
-            <w:r>
-              <w:rPr>
-                <w:rFonts w:ascii="Times New Roman" w:hAnsi="Times New Roman" w:cs="Times New Roman"/>
-                <w:color w:val="FF0000"/>
-                <w:sz w:val="24"/>
-                <w:szCs w:val="24"/>
-              </w:rPr>
-              <w:t>;</w:t>
-            </w:r>
-            <w:r>
-              <w:rPr>
-                <w:rFonts w:ascii="Times New Roman" w:eastAsia="Times New Roman" w:hAnsi="Times New Roman" w:cs="Times New Roman"/>
-                <w:color w:val="FF0000"/>
-                <w:sz w:val="24"/>
-              </w:rPr>
-              <w:t xml:space="preserve"> Ch 17</w:t>
-            </w:r>
-            <w:r>
-              <w:rPr>
-                <w:rFonts w:ascii="Times New Roman" w:eastAsia="Times New Roman" w:hAnsi="Times New Roman" w:cs="Times New Roman"/>
-                <w:color w:val="FF0000"/>
-                <w:sz w:val="24"/>
-              </w:rPr>
-              <w:t xml:space="preserve"> </w:t>
-            </w:r>
-          </w:p>
-          <w:p>
-            <w:pPr>
-              <w:rPr>
-                <w:rFonts w:ascii="Times New Roman" w:hAnsi="Times New Roman" w:cs="Times New Roman"/>
-                <w:color w:val="00B050"/>
-                <w:sz w:val="24"/>
-              </w:rPr>
-            </w:pPr>
-            <w:r>
-              <w:rPr>
-                <w:rFonts w:ascii="Times New Roman" w:hAnsi="Times New Roman" w:cs="Times New Roman"/>
-                <w:color w:val="00B050"/>
-                <w:sz w:val="24"/>
-              </w:rPr>
-              <w:t xml:space="preserve">5.2to5.4, 5.5, 5.7, </w:t>
-            </w:r>
-            <w:r>
-              <w:rPr>
-                <w:rFonts w:ascii="Times New Roman" w:hAnsi="Times New Roman" w:cs="Times New Roman"/>
-                <w:color w:val="00B050"/>
-                <w:sz w:val="24"/>
-              </w:rPr>
-              <w:t xml:space="preserve">17.1, </w:t>
-            </w:r>
-            <w:r>
-              <w:rPr>
-                <w:rFonts w:ascii="Times New Roman" w:hAnsi="Times New Roman" w:cs="Times New Roman"/>
-                <w:color w:val="00B050"/>
-                <w:sz w:val="24"/>
-              </w:rPr>
-              <w:t>17.2</w:t>
-            </w:r>
-          </w:p>
-          <w:p>
-            <w:pPr>
-              <w:rPr>
-                <w:rFonts w:ascii="Times New Roman" w:hAnsi="Times New Roman" w:cs="Times New Roman"/>
-                <w:sz w:val="24"/>
-                <w:szCs w:val="24"/>
-              </w:rPr>
-            </w:pPr>
-            <w:r>
-              <w:rPr>
-                <w:rFonts w:ascii="Times New Roman" w:hAnsi="Times New Roman" w:cs="Times New Roman"/>
-                <w:color w:val="4472C4" w:themeColor="accent5"/>
-                <w:sz w:val="24"/>
-                <w:szCs w:val="24"/>
-              </w:rPr>
-              <w:t>P. 11</w:t>
-            </w:r>
-            <w:r>
-              <w:rPr>
-                <w:rFonts w:ascii="Times New Roman" w:hAnsi="Times New Roman" w:cs="Times New Roman"/>
-                <w:color w:val="4472C4" w:themeColor="accent5"/>
-                <w:sz w:val="24"/>
-                <w:szCs w:val="24"/>
-              </w:rPr>
-              <w:t xml:space="preserve">6 - </w:t>
-            </w:r>
-            <w:r>
-              <w:rPr>
-                <w:rFonts w:ascii="Times New Roman" w:hAnsi="Times New Roman" w:cs="Times New Roman"/>
-                <w:color w:val="4472C4" w:themeColor="accent5"/>
-                <w:sz w:val="24"/>
-                <w:szCs w:val="24"/>
-              </w:rPr>
-              <w:t>127</w:t>
-            </w:r>
+                <w:rFonts w:ascii="Times New Roman" w:hAnsi="Times New Roman" w:cs="Times New Roman"/>
+                <w:sz w:val="24"/>
+                <w:szCs w:val="24"/>
+              </w:rPr>
+            </w:pPr>
           </w:p>
         </w:tc>
         <w:tc>
@@ -3898,39 +3587,6 @@
                 <w:szCs w:val="24"/>
               </w:rPr>
             </w:pPr>
-            <w:r>
-              <w:rPr>
-                <w:rFonts w:ascii="Times New Roman" w:eastAsia="Times New Roman" w:hAnsi="Times New Roman" w:cs="Times New Roman"/>
-                <w:i/>
-                <w:iCs/>
-                <w:color w:val="7030A0"/>
-                <w:sz w:val="24"/>
-                <w:szCs w:val="24"/>
-              </w:rPr>
-              <w:t>Optional (</w:t>
-            </w:r>
-            <w:r>
-              <w:rPr>
-                <w:rFonts w:ascii="Times New Roman" w:eastAsia="Times New Roman" w:hAnsi="Times New Roman" w:cs="Times New Roman"/>
-                <w:i/>
-                <w:iCs/>
-                <w:color w:val="7030A0"/>
-                <w:sz w:val="24"/>
-                <w:szCs w:val="24"/>
-              </w:rPr>
-              <w:t>Module 6 Video/Reading Quiz</w:t>
-            </w:r>
-            <w:r>
-              <w:rPr>
-                <w:rFonts w:ascii="Times New Roman" w:eastAsia="Times New Roman" w:hAnsi="Times New Roman" w:cs="Times New Roman"/>
-                <w:i/>
-                <w:iCs/>
-                <w:color w:val="7030A0"/>
-                <w:sz w:val="24"/>
-                <w:szCs w:val="24"/>
-              </w:rPr>
-              <w:t>)</w:t>
-            </w:r>
           </w:p>
         </w:tc>
       </w:tr>
@@ -3993,15 +3649,7 @@
                 <w:sz w:val="24"/>
                 <w:szCs w:val="24"/>
               </w:rPr>
-              <w:t>Wed 9/</w:t>
-            </w:r>
-            <w:r>
-              <w:rPr>
-                <w:rFonts w:ascii="Times New Roman" w:eastAsia="Times New Roman" w:hAnsi="Times New Roman" w:cs="Times New Roman"/>
-                <w:sz w:val="24"/>
-                <w:szCs w:val="24"/>
-              </w:rPr>
-              <w:t>30</w:t>
+              <w:t>Wed 9/30</w:t>
             </w:r>
           </w:p>
         </w:tc>
@@ -4031,106 +3679,263 @@
             <w:r>
               <w:rPr>
                 <w:rFonts w:ascii="Times New Roman" w:hAnsi="Times New Roman" w:cs="Times New Roman"/>
+                <w:color w:val="auto"/>
+                <w:sz w:val="24"/>
+                <w:szCs w:val="24"/>
+              </w:rPr>
+              <w:t>Activity 9: Summarizing Quantitative Variables</w:t>
+            </w:r>
+          </w:p>
+        </w:tc>
+        <w:tc>
+          <w:tcPr>
+            <w:tcW w:w="2340" w:type="dxa"/>
+            <w:tcBorders>
+              <w:top w:val="single" w:sz="4" w:space="0" w:color="auto"/>
+              <w:left w:val="single" w:sz="4" w:space="0" w:color="000000"/>
+              <w:bottom w:val="single" w:sz="4" w:space="0" w:color="000000"/>
+              <w:right w:val="single" w:sz="4" w:space="0" w:color="000000"/>
+            </w:tcBorders>
+          </w:tcPr>
+          <w:p>
+            <w:pPr>
+              <w:rPr>
+                <w:rFonts w:ascii="Times New Roman" w:eastAsia="Times New Roman" w:hAnsi="Times New Roman" w:cs="Times New Roman"/>
+                <w:color w:val="FF0000"/>
+                <w:sz w:val="24"/>
+              </w:rPr>
+            </w:pPr>
+            <w:r>
+              <w:rPr>
+                <w:rFonts w:ascii="Times New Roman" w:eastAsia="Times New Roman" w:hAnsi="Times New Roman" w:cs="Times New Roman"/>
+                <w:color w:val="FF0000"/>
+                <w:sz w:val="24"/>
+              </w:rPr>
+              <w:t>§</w:t>
+            </w:r>
+            <w:r>
+              <w:rPr>
+                <w:rFonts w:ascii="Times New Roman" w:hAnsi="Times New Roman" w:cs="Times New Roman"/>
+                <w:color w:val="FF0000"/>
+                <w:sz w:val="24"/>
+              </w:rPr>
+              <w:t>5</w:t>
+            </w:r>
+            <w:r>
+              <w:rPr>
+                <w:rFonts w:ascii="Times New Roman" w:hAnsi="Times New Roman" w:cs="Times New Roman"/>
+                <w:color w:val="FF0000"/>
+                <w:sz w:val="24"/>
+              </w:rPr>
+              <w:t>.2</w:t>
+            </w:r>
+            <w:r>
+              <w:rPr>
+                <w:rFonts w:ascii="Times New Roman" w:hAnsi="Times New Roman" w:cs="Times New Roman"/>
+                <w:color w:val="FF0000"/>
+                <w:sz w:val="24"/>
+                <w:szCs w:val="24"/>
+              </w:rPr>
+              <w:t xml:space="preserve">; </w:t>
+            </w:r>
+            <w:r>
+              <w:rPr>
+                <w:rFonts w:ascii="Times New Roman" w:eastAsia="Times New Roman" w:hAnsi="Times New Roman" w:cs="Times New Roman"/>
+                <w:color w:val="FF0000"/>
+                <w:sz w:val="24"/>
+              </w:rPr>
+              <w:t>§</w:t>
+            </w:r>
+            <w:r>
+              <w:rPr>
+                <w:rFonts w:ascii="Times New Roman" w:eastAsia="Times New Roman" w:hAnsi="Times New Roman" w:cs="Times New Roman"/>
+                <w:color w:val="FF0000"/>
+                <w:sz w:val="24"/>
+              </w:rPr>
+              <w:t>5</w:t>
+            </w:r>
+            <w:r>
+              <w:rPr>
+                <w:rFonts w:ascii="Times New Roman" w:eastAsia="Times New Roman" w:hAnsi="Times New Roman" w:cs="Times New Roman"/>
+                <w:color w:val="FF0000"/>
+                <w:sz w:val="24"/>
+              </w:rPr>
+              <w:t>.3</w:t>
+            </w:r>
+            <w:r>
+              <w:rPr>
+                <w:rFonts w:ascii="Times New Roman" w:hAnsi="Times New Roman" w:cs="Times New Roman"/>
+                <w:color w:val="FF0000"/>
+                <w:sz w:val="24"/>
+                <w:szCs w:val="24"/>
+              </w:rPr>
+              <w:t xml:space="preserve">; </w:t>
+            </w:r>
+            <w:r>
+              <w:rPr>
+                <w:rFonts w:ascii="Times New Roman" w:eastAsia="Times New Roman" w:hAnsi="Times New Roman" w:cs="Times New Roman"/>
+                <w:color w:val="FF0000"/>
+                <w:sz w:val="24"/>
+              </w:rPr>
+              <w:t>§</w:t>
+            </w:r>
+            <w:r>
+              <w:rPr>
+                <w:rFonts w:ascii="Times New Roman" w:eastAsia="Times New Roman" w:hAnsi="Times New Roman" w:cs="Times New Roman"/>
+                <w:color w:val="FF0000"/>
+                <w:sz w:val="24"/>
+              </w:rPr>
+              <w:t>5</w:t>
+            </w:r>
+            <w:r>
+              <w:rPr>
+                <w:rFonts w:ascii="Times New Roman" w:eastAsia="Times New Roman" w:hAnsi="Times New Roman" w:cs="Times New Roman"/>
+                <w:color w:val="FF0000"/>
+                <w:sz w:val="24"/>
+              </w:rPr>
+              <w:t>.4</w:t>
+            </w:r>
+            <w:r>
+              <w:rPr>
+                <w:rFonts w:ascii="Times New Roman" w:eastAsia="Times New Roman" w:hAnsi="Times New Roman" w:cs="Times New Roman"/>
+                <w:color w:val="FF0000"/>
+                <w:sz w:val="24"/>
+              </w:rPr>
+              <w:t xml:space="preserve">; </w:t>
+            </w:r>
+            <w:r>
+              <w:rPr>
+                <w:rFonts w:ascii="Times New Roman" w:eastAsia="Times New Roman" w:hAnsi="Times New Roman" w:cs="Times New Roman"/>
+                <w:color w:val="FF0000"/>
+                <w:sz w:val="24"/>
+              </w:rPr>
+              <w:t>§</w:t>
+            </w:r>
+            <w:r>
+              <w:rPr>
+                <w:rFonts w:ascii="Times New Roman" w:hAnsi="Times New Roman" w:cs="Times New Roman"/>
+                <w:color w:val="FF0000"/>
+                <w:sz w:val="24"/>
+              </w:rPr>
+              <w:t>5.5</w:t>
+            </w:r>
+            <w:r>
+              <w:rPr>
+                <w:rFonts w:ascii="Times New Roman" w:hAnsi="Times New Roman" w:cs="Times New Roman"/>
+                <w:color w:val="FF0000"/>
+                <w:sz w:val="24"/>
+                <w:szCs w:val="24"/>
+              </w:rPr>
+              <w:t xml:space="preserve">; </w:t>
+            </w:r>
+            <w:r>
+              <w:rPr>
+                <w:rFonts w:ascii="Times New Roman" w:eastAsia="Times New Roman" w:hAnsi="Times New Roman" w:cs="Times New Roman"/>
+                <w:color w:val="FF0000"/>
+                <w:sz w:val="24"/>
+              </w:rPr>
+              <w:t>§</w:t>
+            </w:r>
+            <w:r>
+              <w:rPr>
+                <w:rFonts w:ascii="Times New Roman" w:eastAsia="Times New Roman" w:hAnsi="Times New Roman" w:cs="Times New Roman"/>
+                <w:color w:val="FF0000"/>
+                <w:sz w:val="24"/>
+              </w:rPr>
+              <w:t>5.7</w:t>
+            </w:r>
+            <w:r>
+              <w:rPr>
+                <w:rFonts w:ascii="Times New Roman" w:hAnsi="Times New Roman" w:cs="Times New Roman"/>
+                <w:color w:val="FF0000"/>
+                <w:sz w:val="24"/>
+                <w:szCs w:val="24"/>
+              </w:rPr>
+              <w:t>;</w:t>
+            </w:r>
+            <w:r>
+              <w:rPr>
+                <w:rFonts w:ascii="Times New Roman" w:eastAsia="Times New Roman" w:hAnsi="Times New Roman" w:cs="Times New Roman"/>
+                <w:color w:val="FF0000"/>
+                <w:sz w:val="24"/>
+              </w:rPr>
+              <w:t xml:space="preserve"> Ch 17</w:t>
+            </w:r>
+            <w:r>
+              <w:rPr>
+                <w:rFonts w:ascii="Times New Roman" w:eastAsia="Times New Roman" w:hAnsi="Times New Roman" w:cs="Times New Roman"/>
+                <w:color w:val="FF0000"/>
+                <w:sz w:val="24"/>
+              </w:rPr>
+              <w:t xml:space="preserve"> </w:t>
+            </w:r>
+          </w:p>
+          <w:p>
+            <w:pPr>
+              <w:rPr>
+                <w:rFonts w:ascii="Times New Roman" w:hAnsi="Times New Roman" w:cs="Times New Roman"/>
+                <w:color w:val="00B050"/>
+                <w:sz w:val="24"/>
+              </w:rPr>
+            </w:pPr>
+            <w:r>
+              <w:rPr>
+                <w:rFonts w:ascii="Times New Roman" w:hAnsi="Times New Roman" w:cs="Times New Roman"/>
+                <w:color w:val="00B050"/>
+                <w:sz w:val="24"/>
+              </w:rPr>
+              <w:t>5.2to5.4, 5.5, 5.7, 17.1, 17.2</w:t>
+            </w:r>
+          </w:p>
+          <w:p>
+            <w:pPr>
+              <w:ind w:right="58"/>
+              <w:rPr>
+                <w:rFonts w:ascii="Times New Roman" w:hAnsi="Times New Roman" w:cs="Times New Roman"/>
+                <w:sz w:val="24"/>
+                <w:szCs w:val="24"/>
+              </w:rPr>
+            </w:pPr>
+            <w:r>
+              <w:rPr>
+                <w:rFonts w:ascii="Times New Roman" w:hAnsi="Times New Roman" w:cs="Times New Roman"/>
+                <w:color w:val="4472C4" w:themeColor="accent5"/>
+                <w:sz w:val="24"/>
+                <w:szCs w:val="24"/>
+              </w:rPr>
+              <w:t>P. 116 - 127</w:t>
+            </w:r>
+          </w:p>
+        </w:tc>
+        <w:tc>
+          <w:tcPr>
+            <w:tcW w:w="2344" w:type="dxa"/>
+            <w:tcBorders>
+              <w:top w:val="single" w:sz="4" w:space="0" w:color="auto"/>
+              <w:left w:val="single" w:sz="4" w:space="0" w:color="000000"/>
+              <w:bottom w:val="single" w:sz="4" w:space="0" w:color="000000"/>
+              <w:right w:val="single" w:sz="4" w:space="0" w:color="000000"/>
+            </w:tcBorders>
+          </w:tcPr>
+          <w:p>
+            <w:pPr>
+              <w:rPr>
+                <w:rFonts w:ascii="Times New Roman" w:eastAsia="Times New Roman" w:hAnsi="Times New Roman" w:cs="Times New Roman"/>
+                <w:sz w:val="24"/>
+                <w:szCs w:val="24"/>
+              </w:rPr>
+            </w:pPr>
+            <w:r>
+              <w:rPr>
+                <w:rFonts w:ascii="Times New Roman" w:eastAsia="Times New Roman" w:hAnsi="Times New Roman" w:cs="Times New Roman"/>
+                <w:i/>
                 <w:iCs/>
-                <w:sz w:val="24"/>
-                <w:szCs w:val="24"/>
-              </w:rPr>
-              <w:t>Activity 1</w:t>
-            </w:r>
-            <w:r>
-              <w:rPr>
-                <w:rFonts w:ascii="Times New Roman" w:hAnsi="Times New Roman" w:cs="Times New Roman"/>
-                <w:iCs/>
-                <w:sz w:val="24"/>
-                <w:szCs w:val="24"/>
-              </w:rPr>
-              <w:t>0</w:t>
-            </w:r>
-            <w:r>
-              <w:rPr>
-                <w:rFonts w:ascii="Times New Roman" w:hAnsi="Times New Roman" w:cs="Times New Roman"/>
-                <w:iCs/>
-                <w:sz w:val="24"/>
-                <w:szCs w:val="24"/>
-              </w:rPr>
-              <w:t xml:space="preserve">: </w:t>
-            </w:r>
-            <w:r>
-              <w:rPr>
-                <w:rFonts w:ascii="Times New Roman" w:hAnsi="Times New Roman" w:cs="Times New Roman"/>
-                <w:iCs/>
-                <w:sz w:val="24"/>
-                <w:szCs w:val="24"/>
-              </w:rPr>
-              <w:t>Inference</w:t>
-            </w:r>
-            <w:r>
-              <w:rPr>
-                <w:rFonts w:ascii="Times New Roman" w:hAnsi="Times New Roman" w:cs="Times New Roman"/>
-                <w:iCs/>
-                <w:sz w:val="24"/>
-                <w:szCs w:val="24"/>
-              </w:rPr>
-              <w:t xml:space="preserve"> of a Single Quantitative Variable</w:t>
-            </w:r>
-            <w:r>
-              <w:rPr>
-                <w:rFonts w:ascii="Times New Roman" w:hAnsi="Times New Roman" w:cs="Times New Roman"/>
-                <w:iCs/>
-                <w:sz w:val="24"/>
-                <w:szCs w:val="24"/>
-              </w:rPr>
-              <w:t xml:space="preserve"> – Simulation Methods</w:t>
-            </w:r>
-          </w:p>
-        </w:tc>
-        <w:tc>
-          <w:tcPr>
-            <w:tcW w:w="2340" w:type="dxa"/>
-            <w:tcBorders>
-              <w:top w:val="single" w:sz="4" w:space="0" w:color="auto"/>
-              <w:left w:val="single" w:sz="4" w:space="0" w:color="000000"/>
-              <w:bottom w:val="single" w:sz="4" w:space="0" w:color="000000"/>
-              <w:right w:val="single" w:sz="4" w:space="0" w:color="000000"/>
-            </w:tcBorders>
-          </w:tcPr>
-          <w:p>
-            <w:pPr>
-              <w:ind w:right="58"/>
-              <w:rPr>
-                <w:rFonts w:ascii="Times New Roman" w:hAnsi="Times New Roman" w:cs="Times New Roman"/>
-                <w:sz w:val="24"/>
-                <w:szCs w:val="24"/>
-              </w:rPr>
-            </w:pPr>
-            <w:r>
-              <w:rPr>
-                <w:rFonts w:ascii="Times New Roman" w:eastAsia="Times New Roman" w:hAnsi="Times New Roman" w:cs="Times New Roman"/>
-                <w:sz w:val="24"/>
-                <w:szCs w:val="24"/>
-              </w:rPr>
-              <w:t xml:space="preserve"> </w:t>
-            </w:r>
-          </w:p>
-        </w:tc>
-        <w:tc>
-          <w:tcPr>
-            <w:tcW w:w="2344" w:type="dxa"/>
-            <w:tcBorders>
-              <w:top w:val="single" w:sz="4" w:space="0" w:color="auto"/>
-              <w:left w:val="single" w:sz="4" w:space="0" w:color="000000"/>
-              <w:bottom w:val="single" w:sz="4" w:space="0" w:color="000000"/>
-              <w:right w:val="single" w:sz="4" w:space="0" w:color="000000"/>
-            </w:tcBorders>
-          </w:tcPr>
-          <w:p>
-            <w:pPr>
-              <w:rPr>
-                <w:rFonts w:ascii="Times New Roman" w:eastAsia="Times New Roman" w:hAnsi="Times New Roman" w:cs="Times New Roman"/>
-                <w:sz w:val="24"/>
-                <w:szCs w:val="24"/>
-              </w:rPr>
-            </w:pPr>
+                <w:color w:val="7030A0"/>
+                <w:sz w:val="24"/>
+                <w:szCs w:val="24"/>
+              </w:rPr>
+              <w:t>Optional (Module 6 Video/Reading Quiz)</w:t>
+            </w:r>
           </w:p>
         </w:tc>
       </w:tr>
@@ -4184,15 +3989,7 @@
                 <w:sz w:val="24"/>
                 <w:szCs w:val="24"/>
               </w:rPr>
-              <w:t xml:space="preserve">Fri </w:t>
-            </w:r>
-            <w:r>
-              <w:rPr>
-                <w:rFonts w:ascii="Times New Roman" w:hAnsi="Times New Roman" w:cs="Times New Roman"/>
-                <w:sz w:val="24"/>
-                <w:szCs w:val="24"/>
-              </w:rPr>
-              <w:t>10/2</w:t>
+              <w:t>Fri 10/2</w:t>
             </w:r>
           </w:p>
         </w:tc>
@@ -4224,7 +4021,7 @@
                 <w:sz w:val="24"/>
                 <w:szCs w:val="24"/>
               </w:rPr>
-              <w:t>Activity 11: Inference of a Single Quantitative Variable – Theoretical Methods</w:t>
+              <w:t>Activity 10: Inference of a Single Quantitative Variable – Simulation Methods</w:t>
             </w:r>
           </w:p>
         </w:tc>
@@ -4240,57 +4037,6 @@
           </w:tcPr>
           <w:p>
             <w:pPr>
-              <w:rPr>
-                <w:rFonts w:ascii="Times New Roman" w:eastAsia="Times New Roman" w:hAnsi="Times New Roman" w:cs="Times New Roman"/>
-                <w:color w:val="FF0000"/>
-                <w:sz w:val="24"/>
-              </w:rPr>
-            </w:pPr>
-            <w:r>
-              <w:rPr>
-                <w:rFonts w:ascii="Times New Roman" w:eastAsia="Times New Roman" w:hAnsi="Times New Roman" w:cs="Times New Roman"/>
-                <w:color w:val="FF0000"/>
-                <w:sz w:val="24"/>
-              </w:rPr>
-              <w:t>Ch 5; Ch 17; Ch 12</w:t>
-            </w:r>
-          </w:p>
-          <w:p>
-            <w:pPr>
-              <w:rPr>
-                <w:rFonts w:ascii="Times New Roman" w:hAnsi="Times New Roman" w:cs="Times New Roman"/>
-                <w:color w:val="00B050"/>
-                <w:sz w:val="24"/>
-              </w:rPr>
-            </w:pPr>
-            <w:r>
-              <w:rPr>
-                <w:rFonts w:ascii="Times New Roman" w:hAnsi="Times New Roman" w:cs="Times New Roman"/>
-                <w:color w:val="00B050"/>
-                <w:sz w:val="24"/>
-              </w:rPr>
-              <w:t>17.3TheoryTests,</w:t>
-            </w:r>
-          </w:p>
-          <w:p>
-            <w:pPr>
-              <w:rPr>
-                <w:rFonts w:ascii="Times New Roman" w:hAnsi="Times New Roman" w:cs="Times New Roman"/>
-                <w:color w:val="00B050"/>
-                <w:sz w:val="24"/>
-              </w:rPr>
-            </w:pPr>
-            <w:r>
-              <w:rPr>
-                <w:rFonts w:ascii="Times New Roman" w:hAnsi="Times New Roman" w:cs="Times New Roman"/>
-                <w:color w:val="00B050"/>
-                <w:sz w:val="24"/>
-              </w:rPr>
-              <w:t>17.3TheoryIntervals, Chapter12</w:t>
-            </w:r>
-          </w:p>
-          <w:p>
-            <w:pPr>
               <w:ind w:right="58"/>
               <w:rPr>
                 <w:rFonts w:ascii="Times New Roman" w:hAnsi="Times New Roman" w:cs="Times New Roman"/>
@@ -4300,30 +4046,11 @@
             </w:pPr>
             <w:r>
               <w:rPr>
-                <w:rFonts w:ascii="Times New Roman" w:hAnsi="Times New Roman" w:cs="Times New Roman"/>
-                <w:color w:val="4472C4" w:themeColor="accent5"/>
-                <w:sz w:val="24"/>
-                <w:szCs w:val="24"/>
-              </w:rPr>
-              <w:t>P. 14</w:t>
-            </w:r>
-            <w:r>
-              <w:rPr>
-                <w:rFonts w:ascii="Times New Roman" w:hAnsi="Times New Roman" w:cs="Times New Roman"/>
-                <w:color w:val="4472C4" w:themeColor="accent5"/>
-                <w:sz w:val="24"/>
-                <w:szCs w:val="24"/>
-              </w:rPr>
-              <w:t xml:space="preserve">6 - </w:t>
-            </w:r>
-            <w:r>
-              <w:rPr>
-                <w:rFonts w:ascii="Times New Roman" w:hAnsi="Times New Roman" w:cs="Times New Roman"/>
-                <w:color w:val="4472C4" w:themeColor="accent5"/>
-                <w:sz w:val="24"/>
-                <w:szCs w:val="24"/>
-              </w:rPr>
-              <w:t>150</w:t>
+                <w:rFonts w:ascii="Times New Roman" w:eastAsia="Times New Roman" w:hAnsi="Times New Roman" w:cs="Times New Roman"/>
+                <w:sz w:val="24"/>
+                <w:szCs w:val="24"/>
+              </w:rPr>
+              <w:t xml:space="preserve"> </w:t>
             </w:r>
           </w:p>
         </w:tc>
@@ -4337,61 +4064,6 @@
               <w:right w:val="single" w:sz="4" w:space="0" w:color="000000"/>
             </w:tcBorders>
           </w:tcPr>
-          <w:p>
-            <w:pPr>
-              <w:rPr>
-                <w:rFonts w:ascii="Times New Roman" w:hAnsi="Times New Roman" w:cs="Times New Roman"/>
-                <w:i/>
-                <w:iCs/>
-                <w:color w:val="7030A0"/>
-                <w:sz w:val="24"/>
-                <w:szCs w:val="24"/>
-              </w:rPr>
-            </w:pPr>
-            <w:r>
-              <w:rPr>
-                <w:rFonts w:ascii="Times New Roman" w:hAnsi="Times New Roman" w:cs="Times New Roman"/>
-                <w:i/>
-                <w:iCs/>
-                <w:color w:val="7030A0"/>
-                <w:sz w:val="24"/>
-                <w:szCs w:val="24"/>
-              </w:rPr>
-              <w:t>Optional (</w:t>
-            </w:r>
-            <w:r>
-              <w:rPr>
-                <w:rFonts w:ascii="Times New Roman" w:hAnsi="Times New Roman" w:cs="Times New Roman"/>
-                <w:i/>
-                <w:iCs/>
-                <w:color w:val="7030A0"/>
-                <w:sz w:val="24"/>
-                <w:szCs w:val="24"/>
-              </w:rPr>
-              <w:t>Module 7 Video/Reading Quiz</w:t>
-            </w:r>
-            <w:r>
-              <w:rPr>
-                <w:rFonts w:ascii="Times New Roman" w:hAnsi="Times New Roman" w:cs="Times New Roman"/>
-                <w:i/>
-                <w:iCs/>
-                <w:color w:val="7030A0"/>
-                <w:sz w:val="24"/>
-                <w:szCs w:val="24"/>
-              </w:rPr>
-              <w:t>)</w:t>
-            </w:r>
-          </w:p>
-          <w:p>
-            <w:pPr>
-              <w:rPr>
-                <w:rFonts w:ascii="Times New Roman" w:hAnsi="Times New Roman" w:cs="Times New Roman"/>
-                <w:color w:val="00B050"/>
-                <w:sz w:val="24"/>
-                <w:szCs w:val="24"/>
-              </w:rPr>
-            </w:pPr>
-          </w:p>
           <w:p>
             <w:pPr>
               <w:rPr>
@@ -4467,15 +4139,7 @@
                 <w:sz w:val="24"/>
                 <w:szCs w:val="24"/>
               </w:rPr>
-              <w:t>Mon</w:t>
-            </w:r>
-            <w:r>
-              <w:rPr>
-                <w:rFonts w:ascii="Times New Roman" w:eastAsia="Times New Roman" w:hAnsi="Times New Roman" w:cs="Times New Roman"/>
-                <w:sz w:val="24"/>
-                <w:szCs w:val="24"/>
-              </w:rPr>
-              <w:t xml:space="preserve"> 10/5</w:t>
+              <w:t>Mon 10/5</w:t>
             </w:r>
           </w:p>
         </w:tc>
@@ -4501,26 +4165,11 @@
             <w:r>
               <w:rPr>
                 <w:rFonts w:ascii="Times New Roman" w:hAnsi="Times New Roman" w:cs="Times New Roman"/>
-                <w:sz w:val="24"/>
-                <w:szCs w:val="24"/>
-              </w:rPr>
-              <w:t>Activity 1</w:t>
-            </w:r>
-            <w:r>
-              <w:rPr>
-                <w:rFonts w:ascii="Times New Roman" w:hAnsi="Times New Roman" w:cs="Times New Roman"/>
-                <w:sz w:val="24"/>
-                <w:szCs w:val="24"/>
-              </w:rPr>
-              <w:t>2</w:t>
-            </w:r>
-            <w:r>
-              <w:rPr>
-                <w:rFonts w:ascii="Times New Roman" w:hAnsi="Times New Roman" w:cs="Times New Roman"/>
-                <w:sz w:val="24"/>
-                <w:szCs w:val="24"/>
-              </w:rPr>
-              <w:t>: Errors and Power</w:t>
+                <w:iCs/>
+                <w:sz w:val="24"/>
+                <w:szCs w:val="24"/>
+              </w:rPr>
+              <w:t>Activity 11: Inference of a Single Quantitative Variable – Theoretical Methods</w:t>
             </w:r>
           </w:p>
         </w:tc>
@@ -4537,11 +4186,71 @@
           <w:p>
             <w:pPr>
               <w:rPr>
-                <w:rFonts w:ascii="Times New Roman" w:hAnsi="Times New Roman" w:cs="Times New Roman"/>
-                <w:sz w:val="24"/>
-                <w:szCs w:val="24"/>
-              </w:rPr>
-            </w:pPr>
+                <w:rFonts w:ascii="Times New Roman" w:eastAsia="Times New Roman" w:hAnsi="Times New Roman" w:cs="Times New Roman"/>
+                <w:color w:val="FF0000"/>
+                <w:sz w:val="24"/>
+              </w:rPr>
+            </w:pPr>
+            <w:r>
+              <w:rPr>
+                <w:rFonts w:ascii="Times New Roman" w:eastAsia="Times New Roman" w:hAnsi="Times New Roman" w:cs="Times New Roman"/>
+                <w:color w:val="FF0000"/>
+                <w:sz w:val="24"/>
+              </w:rPr>
+              <w:t>Ch 5; Ch 17; Ch 12</w:t>
+            </w:r>
+          </w:p>
+          <w:p>
+            <w:pPr>
+              <w:rPr>
+                <w:rFonts w:ascii="Times New Roman" w:hAnsi="Times New Roman" w:cs="Times New Roman"/>
+                <w:color w:val="00B050"/>
+                <w:sz w:val="24"/>
+              </w:rPr>
+            </w:pPr>
+            <w:r>
+              <w:rPr>
+                <w:rFonts w:ascii="Times New Roman" w:hAnsi="Times New Roman" w:cs="Times New Roman"/>
+                <w:color w:val="00B050"/>
+                <w:sz w:val="24"/>
+              </w:rPr>
+              <w:t>17.3TheoryTests,</w:t>
+            </w:r>
+          </w:p>
+          <w:p>
+            <w:pPr>
+              <w:rPr>
+                <w:rFonts w:ascii="Times New Roman" w:hAnsi="Times New Roman" w:cs="Times New Roman"/>
+                <w:color w:val="00B050"/>
+                <w:sz w:val="24"/>
+              </w:rPr>
+            </w:pPr>
+            <w:r>
+              <w:rPr>
+                <w:rFonts w:ascii="Times New Roman" w:hAnsi="Times New Roman" w:cs="Times New Roman"/>
+                <w:color w:val="00B050"/>
+                <w:sz w:val="24"/>
+              </w:rPr>
+              <w:t>17.3TheoryIntervals, Chapter12</w:t>
+            </w:r>
+          </w:p>
+          <w:p>
+            <w:pPr>
+              <w:rPr>
+                <w:rFonts w:ascii="Times New Roman" w:hAnsi="Times New Roman" w:cs="Times New Roman"/>
+                <w:sz w:val="24"/>
+                <w:szCs w:val="24"/>
+              </w:rPr>
+            </w:pPr>
+            <w:r>
+              <w:rPr>
+                <w:rFonts w:ascii="Times New Roman" w:hAnsi="Times New Roman" w:cs="Times New Roman"/>
+                <w:color w:val="4472C4" w:themeColor="accent5"/>
+                <w:sz w:val="24"/>
+                <w:szCs w:val="24"/>
+              </w:rPr>
+              <w:t>P. 146 - 150</w:t>
+            </w:r>
           </w:p>
         </w:tc>
         <w:tc>
@@ -4554,6 +4263,29 @@
               <w:right w:val="single" w:sz="4" w:space="0" w:color="000000"/>
             </w:tcBorders>
           </w:tcPr>
+          <w:p>
+            <w:pPr>
+              <w:rPr>
+                <w:rFonts w:ascii="Times New Roman" w:hAnsi="Times New Roman" w:cs="Times New Roman"/>
+                <w:i/>
+                <w:iCs/>
+                <w:color w:val="7030A0"/>
+                <w:sz w:val="24"/>
+                <w:szCs w:val="24"/>
+              </w:rPr>
+            </w:pPr>
+            <w:r>
+              <w:rPr>
+                <w:rFonts w:ascii="Times New Roman" w:hAnsi="Times New Roman" w:cs="Times New Roman"/>
+                <w:i/>
+                <w:iCs/>
+                <w:color w:val="7030A0"/>
+                <w:sz w:val="24"/>
+                <w:szCs w:val="24"/>
+              </w:rPr>
+              <w:t>Optional (Module 7 Video/Reading Quiz)</w:t>
+            </w:r>
+          </w:p>
           <w:p>
             <w:pPr>
               <w:rPr>
@@ -4650,15 +4382,7 @@
                 <w:sz w:val="24"/>
                 <w:szCs w:val="24"/>
               </w:rPr>
-              <w:t>Wed 10</w:t>
-            </w:r>
-            <w:r>
-              <w:rPr>
-                <w:rFonts w:ascii="Times New Roman" w:hAnsi="Times New Roman" w:cs="Times New Roman"/>
-                <w:sz w:val="24"/>
-                <w:szCs w:val="24"/>
-              </w:rPr>
-              <w:t>/7</w:t>
+              <w:t>Wed 10/7</w:t>
             </w:r>
           </w:p>
         </w:tc>
@@ -4687,7 +4411,7 @@
                 <w:sz w:val="24"/>
                 <w:szCs w:val="24"/>
               </w:rPr>
-              <w:t>Module 6 and 7 Lab: Arsenic</w:t>
+              <w:t>Activity 12: Errors and Power</w:t>
             </w:r>
           </w:p>
         </w:tc>
@@ -4721,52 +4445,6 @@
               <w:right w:val="single" w:sz="4" w:space="0" w:color="000000"/>
             </w:tcBorders>
           </w:tcPr>
-          <w:p>
-            <w:pPr>
-              <w:rPr>
-                <w:rFonts w:ascii="Times New Roman" w:hAnsi="Times New Roman" w:cs="Times New Roman"/>
-                <w:color w:val="4472C4" w:themeColor="accent5"/>
-                <w:sz w:val="24"/>
-                <w:szCs w:val="24"/>
-              </w:rPr>
-            </w:pPr>
-            <w:r>
-              <w:rPr>
-                <w:rFonts w:ascii="Times New Roman" w:hAnsi="Times New Roman" w:cs="Times New Roman"/>
-                <w:color w:val="4472C4" w:themeColor="accent5"/>
-                <w:sz w:val="24"/>
-                <w:szCs w:val="24"/>
-              </w:rPr>
-              <w:t>Module 6</w:t>
-            </w:r>
-            <w:r>
-              <w:rPr>
-                <w:rFonts w:ascii="Times New Roman" w:hAnsi="Times New Roman" w:cs="Times New Roman"/>
-                <w:color w:val="4472C4" w:themeColor="accent5"/>
-                <w:sz w:val="24"/>
-                <w:szCs w:val="24"/>
-              </w:rPr>
-              <w:t xml:space="preserve"> </w:t>
-            </w:r>
-            <w:r>
-              <w:rPr>
-                <w:rFonts w:ascii="Times New Roman" w:hAnsi="Times New Roman" w:cs="Times New Roman"/>
-                <w:color w:val="4472C4" w:themeColor="accent5"/>
-                <w:sz w:val="24"/>
-                <w:szCs w:val="24"/>
-              </w:rPr>
-              <w:t xml:space="preserve">and 7 </w:t>
-            </w:r>
-            <w:r>
-              <w:rPr>
-                <w:rFonts w:ascii="Times New Roman" w:hAnsi="Times New Roman" w:cs="Times New Roman"/>
-                <w:color w:val="4472C4" w:themeColor="accent5"/>
-                <w:sz w:val="24"/>
-                <w:szCs w:val="24"/>
-              </w:rPr>
-              <w:t>Lab</w:t>
-            </w:r>
-          </w:p>
           <w:p>
             <w:pPr>
               <w:rPr>
@@ -4842,15 +4520,7 @@
                 <w:sz w:val="24"/>
                 <w:szCs w:val="24"/>
               </w:rPr>
-              <w:t>Fri 10/</w:t>
-            </w:r>
-            <w:r>
-              <w:rPr>
-                <w:rFonts w:ascii="Times New Roman" w:hAnsi="Times New Roman" w:cs="Times New Roman"/>
-                <w:sz w:val="24"/>
-                <w:szCs w:val="24"/>
-              </w:rPr>
-              <w:t>9</w:t>
+              <w:t>Fri 10/9</w:t>
             </w:r>
           </w:p>
         </w:tc>
@@ -4879,23 +4549,7 @@
                 <w:sz w:val="24"/>
                 <w:szCs w:val="24"/>
               </w:rPr>
-              <w:t>Activity 1</w:t>
-            </w:r>
-            <w:r>
-              <w:rPr>
-                <w:rFonts w:ascii="Times New Roman" w:hAnsi="Times New Roman" w:cs="Times New Roman"/>
-                <w:sz w:val="24"/>
-                <w:szCs w:val="24"/>
-              </w:rPr>
-              <w:t>3</w:t>
-            </w:r>
-            <w:r>
-              <w:rPr>
-                <w:rFonts w:ascii="Times New Roman" w:hAnsi="Times New Roman" w:cs="Times New Roman"/>
-                <w:sz w:val="24"/>
-                <w:szCs w:val="24"/>
-              </w:rPr>
-              <w:t>: Study Design</w:t>
+              <w:t>Module 6 and 7 Lab: Arsenic</w:t>
             </w:r>
           </w:p>
         </w:tc>
@@ -4913,185 +4567,31 @@
             <w:pPr>
               <w:rPr>
                 <w:rFonts w:ascii="Times New Roman" w:hAnsi="Times New Roman" w:cs="Times New Roman"/>
-                <w:color w:val="FF0000"/>
-                <w:sz w:val="24"/>
-                <w:szCs w:val="24"/>
-              </w:rPr>
-            </w:pPr>
-            <w:r>
-              <w:rPr>
-                <w:rFonts w:ascii="Times New Roman" w:eastAsia="Times New Roman" w:hAnsi="Times New Roman" w:cs="Times New Roman"/>
-                <w:color w:val="FF0000"/>
-                <w:sz w:val="24"/>
-              </w:rPr>
-              <w:t>§</w:t>
-            </w:r>
-            <w:r>
-              <w:rPr>
-                <w:rFonts w:ascii="Times New Roman" w:eastAsia="Times New Roman" w:hAnsi="Times New Roman" w:cs="Times New Roman"/>
-                <w:color w:val="FF0000"/>
-                <w:sz w:val="24"/>
-              </w:rPr>
-              <w:t xml:space="preserve">1.2, </w:t>
-            </w:r>
-            <w:r>
-              <w:rPr>
-                <w:rFonts w:ascii="Times New Roman" w:eastAsia="Times New Roman" w:hAnsi="Times New Roman" w:cs="Times New Roman"/>
-                <w:color w:val="FF0000"/>
-                <w:sz w:val="24"/>
-              </w:rPr>
-              <w:t>§</w:t>
-            </w:r>
-            <w:r>
-              <w:rPr>
-                <w:rFonts w:ascii="Times New Roman" w:hAnsi="Times New Roman" w:cs="Times New Roman"/>
-                <w:color w:val="FF0000"/>
-                <w:sz w:val="24"/>
-              </w:rPr>
-              <w:t>2.2</w:t>
-            </w:r>
-            <w:r>
-              <w:rPr>
-                <w:rFonts w:ascii="Times New Roman" w:hAnsi="Times New Roman" w:cs="Times New Roman"/>
-                <w:color w:val="FF0000"/>
-                <w:sz w:val="24"/>
-                <w:szCs w:val="24"/>
-              </w:rPr>
-              <w:t xml:space="preserve">; </w:t>
-            </w:r>
-            <w:r>
-              <w:rPr>
-                <w:rFonts w:ascii="Times New Roman" w:eastAsia="Times New Roman" w:hAnsi="Times New Roman" w:cs="Times New Roman"/>
-                <w:color w:val="FF0000"/>
-                <w:sz w:val="24"/>
-              </w:rPr>
-              <w:t>§2.3</w:t>
-            </w:r>
-            <w:r>
-              <w:rPr>
-                <w:rFonts w:ascii="Times New Roman" w:hAnsi="Times New Roman" w:cs="Times New Roman"/>
-                <w:color w:val="FF0000"/>
-                <w:sz w:val="24"/>
-                <w:szCs w:val="24"/>
-              </w:rPr>
-              <w:t xml:space="preserve">; </w:t>
-            </w:r>
-            <w:r>
-              <w:rPr>
-                <w:rFonts w:ascii="Times New Roman" w:eastAsia="Times New Roman" w:hAnsi="Times New Roman" w:cs="Times New Roman"/>
-                <w:color w:val="FF0000"/>
-                <w:sz w:val="24"/>
-              </w:rPr>
-              <w:t>§2.4; §</w:t>
-            </w:r>
-            <w:r>
-              <w:rPr>
-                <w:rFonts w:ascii="Times New Roman" w:eastAsia="Times New Roman" w:hAnsi="Times New Roman" w:cs="Times New Roman"/>
-                <w:color w:val="FF0000"/>
-                <w:sz w:val="24"/>
-              </w:rPr>
-              <w:t xml:space="preserve">15.1; </w:t>
-            </w:r>
-            <w:r>
-              <w:rPr>
-                <w:rFonts w:ascii="Times New Roman" w:eastAsia="Times New Roman" w:hAnsi="Times New Roman" w:cs="Times New Roman"/>
-                <w:color w:val="FF0000"/>
-                <w:sz w:val="24"/>
-              </w:rPr>
-              <w:t>§1</w:t>
-            </w:r>
-            <w:r>
-              <w:rPr>
-                <w:rFonts w:ascii="Times New Roman" w:hAnsi="Times New Roman" w:cs="Times New Roman"/>
-                <w:color w:val="FF0000"/>
-                <w:sz w:val="24"/>
-              </w:rPr>
-              <w:t>5</w:t>
-            </w:r>
-            <w:r>
-              <w:rPr>
-                <w:rFonts w:ascii="Times New Roman" w:hAnsi="Times New Roman" w:cs="Times New Roman"/>
-                <w:color w:val="FF0000"/>
-                <w:sz w:val="24"/>
-                <w:szCs w:val="24"/>
-              </w:rPr>
-              <w:t>.2</w:t>
-            </w:r>
-            <w:r>
-              <w:rPr>
-                <w:rFonts w:ascii="Times New Roman" w:hAnsi="Times New Roman" w:cs="Times New Roman"/>
-                <w:color w:val="FF0000"/>
-                <w:sz w:val="24"/>
-                <w:szCs w:val="24"/>
-              </w:rPr>
-              <w:t>; Ch 4; Ch 16</w:t>
-            </w:r>
-          </w:p>
-          <w:p>
-            <w:pPr>
-              <w:rPr>
-                <w:rFonts w:ascii="Times New Roman" w:eastAsia="Times New Roman" w:hAnsi="Times New Roman" w:cs="Times New Roman"/>
-                <w:color w:val="FF0000"/>
-                <w:sz w:val="24"/>
-              </w:rPr>
-            </w:pPr>
-            <w:r>
-              <w:rPr>
-                <w:rFonts w:ascii="Times New Roman" w:hAnsi="Times New Roman" w:cs="Times New Roman"/>
-                <w:color w:val="00B050"/>
-                <w:sz w:val="24"/>
-                <w:szCs w:val="24"/>
-              </w:rPr>
-              <w:t>1.2.3to1.2.5,</w:t>
-            </w:r>
-          </w:p>
-          <w:p>
-            <w:pPr>
-              <w:rPr>
-                <w:rFonts w:ascii="Times New Roman" w:hAnsi="Times New Roman" w:cs="Times New Roman"/>
-                <w:color w:val="00B050"/>
-                <w:sz w:val="24"/>
-                <w:szCs w:val="24"/>
-              </w:rPr>
-            </w:pPr>
-            <w:r>
-              <w:rPr>
-                <w:rFonts w:ascii="Times New Roman" w:hAnsi="Times New Roman" w:cs="Times New Roman"/>
-                <w:color w:val="00B050"/>
-                <w:sz w:val="24"/>
-                <w:szCs w:val="24"/>
-              </w:rPr>
-              <w:t xml:space="preserve"> 2.2to2.4, 4.1_TwoProp, 4.2_TwoProp, 4.4, 15.1, 15.2, </w:t>
-            </w:r>
-            <w:proofErr w:type="spellStart"/>
-            <w:r>
-              <w:rPr>
-                <w:rFonts w:ascii="Times New Roman" w:hAnsi="Times New Roman" w:cs="Times New Roman"/>
-                <w:color w:val="00B050"/>
-                <w:sz w:val="24"/>
-                <w:szCs w:val="24"/>
-              </w:rPr>
-              <w:t>RelativeRisk</w:t>
-            </w:r>
-            <w:proofErr w:type="spellEnd"/>
-          </w:p>
-          <w:p>
-            <w:pPr>
-              <w:rPr>
-                <w:rFonts w:ascii="Times New Roman" w:hAnsi="Times New Roman" w:cs="Times New Roman"/>
-                <w:sz w:val="24"/>
-                <w:szCs w:val="24"/>
-              </w:rPr>
-            </w:pPr>
-            <w:r>
+                <w:sz w:val="24"/>
+                <w:szCs w:val="24"/>
+              </w:rPr>
+            </w:pPr>
+          </w:p>
+        </w:tc>
+        <w:tc>
+          <w:tcPr>
+            <w:tcW w:w="2344" w:type="dxa"/>
+            <w:tcBorders>
+              <w:top w:val="single" w:sz="4" w:space="0" w:color="000000"/>
+              <w:left w:val="single" w:sz="4" w:space="0" w:color="000000"/>
+              <w:bottom w:val="double" w:sz="4" w:space="0" w:color="000000"/>
+              <w:right w:val="single" w:sz="4" w:space="0" w:color="000000"/>
+            </w:tcBorders>
+          </w:tcPr>
+          <w:p>
+            <w:pPr>
               <w:rPr>
                 <w:rFonts w:ascii="Times New Roman" w:hAnsi="Times New Roman" w:cs="Times New Roman"/>
                 <w:color w:val="4472C4" w:themeColor="accent5"/>
                 <w:sz w:val="24"/>
                 <w:szCs w:val="24"/>
               </w:rPr>
-              <w:t>P. 1</w:t>
-            </w:r>
+            </w:pPr>
             <w:r>
               <w:rPr>
                 <w:rFonts w:ascii="Times New Roman" w:hAnsi="Times New Roman" w:cs="Times New Roman"/>
@@ -5099,7 +4599,7 @@
                 <w:sz w:val="24"/>
                 <w:szCs w:val="24"/>
               </w:rPr>
-              <w:t xml:space="preserve">72 - </w:t>
+              <w:t>Module 6</w:t>
             </w:r>
             <w:r>
               <w:rPr>
@@ -5108,63 +4608,25 @@
                 <w:sz w:val="24"/>
                 <w:szCs w:val="24"/>
               </w:rPr>
-              <w:t>189</w:t>
-            </w:r>
-          </w:p>
-        </w:tc>
-        <w:tc>
-          <w:tcPr>
-            <w:tcW w:w="2344" w:type="dxa"/>
-            <w:tcBorders>
-              <w:top w:val="single" w:sz="4" w:space="0" w:color="000000"/>
-              <w:left w:val="single" w:sz="4" w:space="0" w:color="000000"/>
-              <w:bottom w:val="double" w:sz="4" w:space="0" w:color="000000"/>
-              <w:right w:val="single" w:sz="4" w:space="0" w:color="000000"/>
-            </w:tcBorders>
-          </w:tcPr>
-          <w:p>
-            <w:pPr>
-              <w:rPr>
-                <w:rFonts w:ascii="Times New Roman" w:hAnsi="Times New Roman" w:cs="Times New Roman"/>
-                <w:i/>
-                <w:iCs/>
-                <w:color w:val="7030A0"/>
-                <w:sz w:val="24"/>
-                <w:szCs w:val="24"/>
-              </w:rPr>
-            </w:pPr>
-            <w:r>
-              <w:rPr>
-                <w:rFonts w:ascii="Times New Roman" w:hAnsi="Times New Roman" w:cs="Times New Roman"/>
-                <w:i/>
-                <w:iCs/>
-                <w:color w:val="7030A0"/>
-                <w:sz w:val="24"/>
-                <w:szCs w:val="24"/>
-              </w:rPr>
-              <w:t>Optional (</w:t>
-            </w:r>
-            <w:r>
-              <w:rPr>
-                <w:rFonts w:ascii="Times New Roman" w:hAnsi="Times New Roman" w:cs="Times New Roman"/>
-                <w:i/>
-                <w:iCs/>
-                <w:color w:val="7030A0"/>
-                <w:sz w:val="24"/>
-                <w:szCs w:val="24"/>
-              </w:rPr>
-              <w:t>Module 8 Video/Reading Quiz</w:t>
-            </w:r>
-            <w:r>
-              <w:rPr>
-                <w:rFonts w:ascii="Times New Roman" w:hAnsi="Times New Roman" w:cs="Times New Roman"/>
-                <w:i/>
-                <w:iCs/>
-                <w:color w:val="7030A0"/>
-                <w:sz w:val="24"/>
-                <w:szCs w:val="24"/>
-              </w:rPr>
-              <w:t>)</w:t>
+              <w:t xml:space="preserve"> </w:t>
+            </w:r>
+            <w:r>
+              <w:rPr>
+                <w:rFonts w:ascii="Times New Roman" w:hAnsi="Times New Roman" w:cs="Times New Roman"/>
+                <w:color w:val="4472C4" w:themeColor="accent5"/>
+                <w:sz w:val="24"/>
+                <w:szCs w:val="24"/>
+              </w:rPr>
+              <w:t xml:space="preserve">and 7 </w:t>
+            </w:r>
+            <w:r>
+              <w:rPr>
+                <w:rFonts w:ascii="Times New Roman" w:hAnsi="Times New Roman" w:cs="Times New Roman"/>
+                <w:color w:val="4472C4" w:themeColor="accent5"/>
+                <w:sz w:val="24"/>
+                <w:szCs w:val="24"/>
+              </w:rPr>
+              <w:t>Lab</w:t>
             </w:r>
           </w:p>
           <w:p>
@@ -5242,15 +4704,7 @@
                 <w:sz w:val="24"/>
                 <w:szCs w:val="24"/>
               </w:rPr>
-              <w:t>Mon 10/</w:t>
-            </w:r>
-            <w:r>
-              <w:rPr>
-                <w:rFonts w:ascii="Times New Roman" w:eastAsia="Times New Roman" w:hAnsi="Times New Roman" w:cs="Times New Roman"/>
-                <w:sz w:val="24"/>
-                <w:szCs w:val="24"/>
-              </w:rPr>
-              <w:t>12</w:t>
+              <w:t>Mon 10/12</w:t>
             </w:r>
           </w:p>
         </w:tc>
@@ -5266,85 +4720,251 @@
           </w:tcPr>
           <w:p>
             <w:pPr>
-              <w:ind w:left="5" w:right="442"/>
-              <w:rPr>
-                <w:rFonts w:ascii="Times New Roman" w:hAnsi="Times New Roman" w:cs="Times New Roman"/>
-                <w:b/>
-                <w:bCs/>
-                <w:color w:val="auto"/>
-                <w:sz w:val="24"/>
-                <w:szCs w:val="24"/>
-              </w:rPr>
-            </w:pPr>
-            <w:r>
-              <w:rPr>
-                <w:rFonts w:ascii="Times New Roman" w:hAnsi="Times New Roman" w:cs="Times New Roman"/>
+              <w:ind w:left="5"/>
+              <w:rPr>
+                <w:rFonts w:ascii="Times New Roman" w:hAnsi="Times New Roman" w:cs="Times New Roman"/>
+                <w:sz w:val="24"/>
+                <w:szCs w:val="24"/>
+              </w:rPr>
+            </w:pPr>
+            <w:r>
+              <w:rPr>
+                <w:rFonts w:ascii="Times New Roman" w:hAnsi="Times New Roman" w:cs="Times New Roman"/>
+                <w:sz w:val="24"/>
+                <w:szCs w:val="24"/>
+              </w:rPr>
+              <w:t>Activity 13: Study Design</w:t>
+            </w:r>
+          </w:p>
+        </w:tc>
+        <w:tc>
+          <w:tcPr>
+            <w:tcW w:w="2340" w:type="dxa"/>
+            <w:tcBorders>
+              <w:top w:val="double" w:sz="4" w:space="0" w:color="000000"/>
+              <w:left w:val="single" w:sz="4" w:space="0" w:color="000000"/>
+              <w:bottom w:val="single" w:sz="4" w:space="0" w:color="auto"/>
+              <w:right w:val="single" w:sz="4" w:space="0" w:color="000000"/>
+            </w:tcBorders>
+          </w:tcPr>
+          <w:p>
+            <w:pPr>
+              <w:rPr>
+                <w:rFonts w:ascii="Times New Roman" w:hAnsi="Times New Roman" w:cs="Times New Roman"/>
+                <w:color w:val="FF0000"/>
+                <w:sz w:val="24"/>
+                <w:szCs w:val="24"/>
+              </w:rPr>
+            </w:pPr>
+            <w:r>
+              <w:rPr>
+                <w:rFonts w:ascii="Times New Roman" w:eastAsia="Times New Roman" w:hAnsi="Times New Roman" w:cs="Times New Roman"/>
+                <w:color w:val="FF0000"/>
+                <w:sz w:val="24"/>
+              </w:rPr>
+              <w:t>§</w:t>
+            </w:r>
+            <w:r>
+              <w:rPr>
+                <w:rFonts w:ascii="Times New Roman" w:eastAsia="Times New Roman" w:hAnsi="Times New Roman" w:cs="Times New Roman"/>
+                <w:color w:val="FF0000"/>
+                <w:sz w:val="24"/>
+              </w:rPr>
+              <w:t xml:space="preserve">1.2, </w:t>
+            </w:r>
+            <w:r>
+              <w:rPr>
+                <w:rFonts w:ascii="Times New Roman" w:eastAsia="Times New Roman" w:hAnsi="Times New Roman" w:cs="Times New Roman"/>
+                <w:color w:val="FF0000"/>
+                <w:sz w:val="24"/>
+              </w:rPr>
+              <w:t>§</w:t>
+            </w:r>
+            <w:r>
+              <w:rPr>
+                <w:rFonts w:ascii="Times New Roman" w:hAnsi="Times New Roman" w:cs="Times New Roman"/>
+                <w:color w:val="FF0000"/>
+                <w:sz w:val="24"/>
+              </w:rPr>
+              <w:t>2.2</w:t>
+            </w:r>
+            <w:r>
+              <w:rPr>
+                <w:rFonts w:ascii="Times New Roman" w:hAnsi="Times New Roman" w:cs="Times New Roman"/>
+                <w:color w:val="FF0000"/>
+                <w:sz w:val="24"/>
+                <w:szCs w:val="24"/>
+              </w:rPr>
+              <w:t xml:space="preserve">; </w:t>
+            </w:r>
+            <w:r>
+              <w:rPr>
+                <w:rFonts w:ascii="Times New Roman" w:eastAsia="Times New Roman" w:hAnsi="Times New Roman" w:cs="Times New Roman"/>
+                <w:color w:val="FF0000"/>
+                <w:sz w:val="24"/>
+              </w:rPr>
+              <w:t>§2.3</w:t>
+            </w:r>
+            <w:r>
+              <w:rPr>
+                <w:rFonts w:ascii="Times New Roman" w:hAnsi="Times New Roman" w:cs="Times New Roman"/>
+                <w:color w:val="FF0000"/>
+                <w:sz w:val="24"/>
+                <w:szCs w:val="24"/>
+              </w:rPr>
+              <w:t xml:space="preserve">; </w:t>
+            </w:r>
+            <w:r>
+              <w:rPr>
+                <w:rFonts w:ascii="Times New Roman" w:eastAsia="Times New Roman" w:hAnsi="Times New Roman" w:cs="Times New Roman"/>
+                <w:color w:val="FF0000"/>
+                <w:sz w:val="24"/>
+              </w:rPr>
+              <w:t>§2.4; §</w:t>
+            </w:r>
+            <w:r>
+              <w:rPr>
+                <w:rFonts w:ascii="Times New Roman" w:eastAsia="Times New Roman" w:hAnsi="Times New Roman" w:cs="Times New Roman"/>
+                <w:color w:val="FF0000"/>
+                <w:sz w:val="24"/>
+              </w:rPr>
+              <w:t xml:space="preserve">15.1; </w:t>
+            </w:r>
+            <w:r>
+              <w:rPr>
+                <w:rFonts w:ascii="Times New Roman" w:eastAsia="Times New Roman" w:hAnsi="Times New Roman" w:cs="Times New Roman"/>
+                <w:color w:val="FF0000"/>
+                <w:sz w:val="24"/>
+              </w:rPr>
+              <w:t>§1</w:t>
+            </w:r>
+            <w:r>
+              <w:rPr>
+                <w:rFonts w:ascii="Times New Roman" w:hAnsi="Times New Roman" w:cs="Times New Roman"/>
+                <w:color w:val="FF0000"/>
+                <w:sz w:val="24"/>
+              </w:rPr>
+              <w:t>5</w:t>
+            </w:r>
+            <w:r>
+              <w:rPr>
+                <w:rFonts w:ascii="Times New Roman" w:hAnsi="Times New Roman" w:cs="Times New Roman"/>
+                <w:color w:val="FF0000"/>
+                <w:sz w:val="24"/>
+                <w:szCs w:val="24"/>
+              </w:rPr>
+              <w:t>.2</w:t>
+            </w:r>
+            <w:r>
+              <w:rPr>
+                <w:rFonts w:ascii="Times New Roman" w:hAnsi="Times New Roman" w:cs="Times New Roman"/>
+                <w:color w:val="FF0000"/>
+                <w:sz w:val="24"/>
+                <w:szCs w:val="24"/>
+              </w:rPr>
+              <w:t>; Ch 4; Ch 16</w:t>
+            </w:r>
+          </w:p>
+          <w:p>
+            <w:pPr>
+              <w:rPr>
+                <w:rFonts w:ascii="Times New Roman" w:eastAsia="Times New Roman" w:hAnsi="Times New Roman" w:cs="Times New Roman"/>
+                <w:color w:val="FF0000"/>
+                <w:sz w:val="24"/>
+              </w:rPr>
+            </w:pPr>
+            <w:r>
+              <w:rPr>
+                <w:rFonts w:ascii="Times New Roman" w:hAnsi="Times New Roman" w:cs="Times New Roman"/>
+                <w:color w:val="00B050"/>
+                <w:sz w:val="24"/>
+                <w:szCs w:val="24"/>
+              </w:rPr>
+              <w:t>1.2.3to1.2.5,</w:t>
+            </w:r>
+          </w:p>
+          <w:p>
+            <w:pPr>
+              <w:rPr>
+                <w:rFonts w:ascii="Times New Roman" w:hAnsi="Times New Roman" w:cs="Times New Roman"/>
+                <w:color w:val="00B050"/>
+                <w:sz w:val="24"/>
+                <w:szCs w:val="24"/>
+              </w:rPr>
+            </w:pPr>
+            <w:r>
+              <w:rPr>
+                <w:rFonts w:ascii="Times New Roman" w:hAnsi="Times New Roman" w:cs="Times New Roman"/>
+                <w:color w:val="00B050"/>
+                <w:sz w:val="24"/>
+                <w:szCs w:val="24"/>
+              </w:rPr>
+              <w:t xml:space="preserve"> 2.2to2.4, 4.1_TwoProp, 4.2_TwoProp, 4.4, 15.1, 15.2, </w:t>
+            </w:r>
+            <w:proofErr w:type="spellStart"/>
+            <w:r>
+              <w:rPr>
+                <w:rFonts w:ascii="Times New Roman" w:hAnsi="Times New Roman" w:cs="Times New Roman"/>
+                <w:color w:val="00B050"/>
+                <w:sz w:val="24"/>
+                <w:szCs w:val="24"/>
+              </w:rPr>
+              <w:t>RelativeRisk</w:t>
+            </w:r>
+            <w:proofErr w:type="spellEnd"/>
+          </w:p>
+          <w:p>
+            <w:pPr>
+              <w:rPr>
+                <w:rFonts w:ascii="Times New Roman" w:hAnsi="Times New Roman" w:cs="Times New Roman"/>
+                <w:sz w:val="24"/>
+                <w:szCs w:val="24"/>
+              </w:rPr>
+            </w:pPr>
+            <w:r>
+              <w:rPr>
+                <w:rFonts w:ascii="Times New Roman" w:hAnsi="Times New Roman" w:cs="Times New Roman"/>
+                <w:color w:val="4472C4" w:themeColor="accent5"/>
+                <w:sz w:val="24"/>
+                <w:szCs w:val="24"/>
+              </w:rPr>
+              <w:t>P. 172 - 189</w:t>
+            </w:r>
+          </w:p>
+        </w:tc>
+        <w:tc>
+          <w:tcPr>
+            <w:tcW w:w="2344" w:type="dxa"/>
+            <w:tcBorders>
+              <w:top w:val="double" w:sz="4" w:space="0" w:color="000000"/>
+              <w:left w:val="single" w:sz="4" w:space="0" w:color="000000"/>
+              <w:bottom w:val="single" w:sz="4" w:space="0" w:color="auto"/>
+              <w:right w:val="single" w:sz="4" w:space="0" w:color="000000"/>
+            </w:tcBorders>
+          </w:tcPr>
+          <w:p>
+            <w:pPr>
+              <w:rPr>
+                <w:rFonts w:ascii="Times New Roman" w:hAnsi="Times New Roman" w:cs="Times New Roman"/>
+                <w:i/>
                 <w:iCs/>
-                <w:sz w:val="24"/>
-                <w:szCs w:val="24"/>
-              </w:rPr>
-              <w:t>Activity 1</w:t>
-            </w:r>
-            <w:r>
-              <w:rPr>
-                <w:rFonts w:ascii="Times New Roman" w:hAnsi="Times New Roman" w:cs="Times New Roman"/>
+                <w:color w:val="7030A0"/>
+                <w:sz w:val="24"/>
+                <w:szCs w:val="24"/>
+              </w:rPr>
+            </w:pPr>
+            <w:r>
+              <w:rPr>
+                <w:rFonts w:ascii="Times New Roman" w:hAnsi="Times New Roman" w:cs="Times New Roman"/>
+                <w:i/>
                 <w:iCs/>
-                <w:sz w:val="24"/>
-                <w:szCs w:val="24"/>
-              </w:rPr>
-              <w:t>4</w:t>
-            </w:r>
-            <w:r>
-              <w:rPr>
-                <w:rFonts w:ascii="Times New Roman" w:hAnsi="Times New Roman" w:cs="Times New Roman"/>
-                <w:iCs/>
-                <w:sz w:val="24"/>
-                <w:szCs w:val="24"/>
-              </w:rPr>
-              <w:t>: Summarizing Two Categorical Variables</w:t>
-            </w:r>
-          </w:p>
-          <w:p>
-            <w:pPr>
-              <w:ind w:left="5"/>
-              <w:rPr>
-                <w:rFonts w:ascii="Times New Roman" w:hAnsi="Times New Roman" w:cs="Times New Roman"/>
-                <w:sz w:val="24"/>
-                <w:szCs w:val="24"/>
-              </w:rPr>
-            </w:pPr>
-          </w:p>
-        </w:tc>
-        <w:tc>
-          <w:tcPr>
-            <w:tcW w:w="2340" w:type="dxa"/>
-            <w:tcBorders>
-              <w:top w:val="double" w:sz="4" w:space="0" w:color="000000"/>
-              <w:left w:val="single" w:sz="4" w:space="0" w:color="000000"/>
-              <w:bottom w:val="single" w:sz="4" w:space="0" w:color="auto"/>
-              <w:right w:val="single" w:sz="4" w:space="0" w:color="000000"/>
-            </w:tcBorders>
-          </w:tcPr>
-          <w:p>
-            <w:pPr>
-              <w:rPr>
-                <w:rFonts w:ascii="Times New Roman" w:hAnsi="Times New Roman" w:cs="Times New Roman"/>
-                <w:sz w:val="24"/>
-                <w:szCs w:val="24"/>
-              </w:rPr>
-            </w:pPr>
-          </w:p>
-        </w:tc>
-        <w:tc>
-          <w:tcPr>
-            <w:tcW w:w="2344" w:type="dxa"/>
-            <w:tcBorders>
-              <w:top w:val="double" w:sz="4" w:space="0" w:color="000000"/>
-              <w:left w:val="single" w:sz="4" w:space="0" w:color="000000"/>
-              <w:bottom w:val="single" w:sz="4" w:space="0" w:color="auto"/>
-              <w:right w:val="single" w:sz="4" w:space="0" w:color="000000"/>
-            </w:tcBorders>
-          </w:tcPr>
+                <w:color w:val="7030A0"/>
+                <w:sz w:val="24"/>
+                <w:szCs w:val="24"/>
+              </w:rPr>
+              <w:t>Optional (Module 8 Video/Reading Quiz)</w:t>
+            </w:r>
+          </w:p>
           <w:p>
             <w:pPr>
               <w:rPr>
@@ -5440,15 +5060,7 @@
                 <w:sz w:val="24"/>
                 <w:szCs w:val="24"/>
               </w:rPr>
-              <w:t>Wed 10/</w:t>
-            </w:r>
-            <w:r>
-              <w:rPr>
-                <w:rFonts w:ascii="Times New Roman" w:hAnsi="Times New Roman" w:cs="Times New Roman"/>
-                <w:sz w:val="24"/>
-                <w:szCs w:val="24"/>
-              </w:rPr>
-              <w:t>14</w:t>
+              <w:t>Wed 10/14</w:t>
             </w:r>
           </w:p>
         </w:tc>
@@ -5467,37 +5079,13 @@
               <w:ind w:left="5" w:right="442"/>
               <w:rPr>
                 <w:rFonts w:ascii="Times New Roman" w:hAnsi="Times New Roman" w:cs="Times New Roman"/>
-                <w:sz w:val="24"/>
-                <w:szCs w:val="24"/>
-              </w:rPr>
-            </w:pPr>
-            <w:r>
-              <w:rPr>
-                <w:rFonts w:ascii="Times New Roman" w:hAnsi="Times New Roman" w:cs="Times New Roman"/>
+                <w:b/>
+                <w:bCs/>
                 <w:color w:val="auto"/>
                 <w:sz w:val="24"/>
                 <w:szCs w:val="24"/>
               </w:rPr>
-              <w:t>Activity 1</w:t>
-            </w:r>
-            <w:r>
-              <w:rPr>
-                <w:rFonts w:ascii="Times New Roman" w:hAnsi="Times New Roman" w:cs="Times New Roman"/>
-                <w:color w:val="auto"/>
-                <w:sz w:val="24"/>
-                <w:szCs w:val="24"/>
-              </w:rPr>
-              <w:t>5</w:t>
-            </w:r>
-            <w:r>
-              <w:rPr>
-                <w:rFonts w:ascii="Times New Roman" w:hAnsi="Times New Roman" w:cs="Times New Roman"/>
-                <w:color w:val="auto"/>
-                <w:sz w:val="24"/>
-                <w:szCs w:val="24"/>
-              </w:rPr>
-              <w:t xml:space="preserve">: </w:t>
-            </w:r>
+            </w:pPr>
             <w:r>
               <w:rPr>
                 <w:rFonts w:ascii="Times New Roman" w:hAnsi="Times New Roman" w:cs="Times New Roman"/>
@@ -5505,8 +5093,18 @@
                 <w:sz w:val="24"/>
                 <w:szCs w:val="24"/>
               </w:rPr>
-              <w:t>The Good Samaritan</w:t>
-            </w:r>
+              <w:t>Activity 14: Summarizing Two Categorical Variables</w:t>
+            </w:r>
+          </w:p>
+          <w:p>
+            <w:pPr>
+              <w:ind w:left="5" w:right="442"/>
+              <w:rPr>
+                <w:rFonts w:ascii="Times New Roman" w:hAnsi="Times New Roman" w:cs="Times New Roman"/>
+                <w:sz w:val="24"/>
+                <w:szCs w:val="24"/>
+              </w:rPr>
+            </w:pPr>
           </w:p>
         </w:tc>
         <w:tc>
@@ -5616,15 +5214,7 @@
                 <w:sz w:val="24"/>
                 <w:szCs w:val="24"/>
               </w:rPr>
-              <w:t>Fri 10/1</w:t>
-            </w:r>
-            <w:r>
-              <w:rPr>
-                <w:rFonts w:ascii="Times New Roman" w:hAnsi="Times New Roman" w:cs="Times New Roman"/>
-                <w:sz w:val="24"/>
-                <w:szCs w:val="24"/>
-              </w:rPr>
-              <w:t>6</w:t>
+              <w:t>Fri 10/16</w:t>
             </w:r>
           </w:p>
         </w:tc>
@@ -5654,29 +5244,20 @@
             <w:r>
               <w:rPr>
                 <w:rFonts w:ascii="Times New Roman" w:hAnsi="Times New Roman" w:cs="Times New Roman"/>
+                <w:color w:val="auto"/>
+                <w:sz w:val="24"/>
+                <w:szCs w:val="24"/>
+              </w:rPr>
+              <w:t xml:space="preserve">Activity 15: </w:t>
+            </w:r>
+            <w:r>
+              <w:rPr>
+                <w:rFonts w:ascii="Times New Roman" w:hAnsi="Times New Roman" w:cs="Times New Roman"/>
                 <w:iCs/>
                 <w:sz w:val="24"/>
                 <w:szCs w:val="24"/>
               </w:rPr>
-              <w:t>Activity 1</w:t>
-            </w:r>
-            <w:r>
-              <w:rPr>
-                <w:rFonts w:ascii="Times New Roman" w:hAnsi="Times New Roman" w:cs="Times New Roman"/>
-                <w:iCs/>
-                <w:sz w:val="24"/>
-                <w:szCs w:val="24"/>
-              </w:rPr>
-              <w:t>6</w:t>
-            </w:r>
-            <w:r>
-              <w:rPr>
-                <w:rFonts w:ascii="Times New Roman" w:hAnsi="Times New Roman" w:cs="Times New Roman"/>
-                <w:iCs/>
-                <w:sz w:val="24"/>
-                <w:szCs w:val="24"/>
-              </w:rPr>
-              <w:t>: Winter Sports Helmet Use and Head Injuries</w:t>
+              <w:t>The Good Samaritan</w:t>
             </w:r>
           </w:p>
         </w:tc>
@@ -5694,89 +5275,10 @@
             <w:pPr>
               <w:rPr>
                 <w:rFonts w:ascii="Times New Roman" w:hAnsi="Times New Roman" w:cs="Times New Roman"/>
-                <w:color w:val="FF0000"/>
-                <w:sz w:val="24"/>
-                <w:szCs w:val="24"/>
-              </w:rPr>
-            </w:pPr>
-            <w:r>
-              <w:rPr>
-                <w:rFonts w:ascii="Times New Roman" w:eastAsia="Times New Roman" w:hAnsi="Times New Roman" w:cs="Times New Roman"/>
-                <w:color w:val="FF0000"/>
-                <w:sz w:val="24"/>
-              </w:rPr>
-              <w:t>§1</w:t>
-            </w:r>
-            <w:r>
-              <w:rPr>
-                <w:rFonts w:ascii="Times New Roman" w:hAnsi="Times New Roman" w:cs="Times New Roman"/>
-                <w:color w:val="FF0000"/>
-                <w:sz w:val="24"/>
-                <w:szCs w:val="24"/>
-              </w:rPr>
-              <w:t xml:space="preserve">5.3; </w:t>
-            </w:r>
-            <w:r>
-              <w:rPr>
-                <w:rFonts w:ascii="Times New Roman" w:eastAsia="Times New Roman" w:hAnsi="Times New Roman" w:cs="Times New Roman"/>
-                <w:color w:val="FF0000"/>
-                <w:sz w:val="24"/>
-              </w:rPr>
-              <w:t>§15.4</w:t>
-            </w:r>
-          </w:p>
-          <w:p>
-            <w:pPr>
-              <w:rPr>
-                <w:rFonts w:ascii="Times New Roman" w:hAnsi="Times New Roman" w:cs="Times New Roman"/>
-                <w:color w:val="00B050"/>
-                <w:sz w:val="24"/>
-              </w:rPr>
-            </w:pPr>
-            <w:r>
-              <w:rPr>
-                <w:rFonts w:ascii="Times New Roman" w:hAnsi="Times New Roman" w:cs="Times New Roman"/>
-                <w:color w:val="00B050"/>
-                <w:sz w:val="24"/>
-              </w:rPr>
-              <w:t>15.3TheoryTests, 15.3TheoryIntervals</w:t>
-            </w:r>
-          </w:p>
-          <w:p>
-            <w:pPr>
-              <w:rPr>
-                <w:rFonts w:ascii="Times New Roman" w:hAnsi="Times New Roman" w:cs="Times New Roman"/>
-                <w:sz w:val="24"/>
-                <w:szCs w:val="24"/>
-              </w:rPr>
-            </w:pPr>
-            <w:r>
-              <w:rPr>
-                <w:rFonts w:ascii="Times New Roman" w:hAnsi="Times New Roman" w:cs="Times New Roman"/>
-                <w:color w:val="4472C4" w:themeColor="accent5"/>
-                <w:sz w:val="24"/>
-                <w:szCs w:val="24"/>
-              </w:rPr>
-              <w:t>P. 2</w:t>
-            </w:r>
-            <w:r>
-              <w:rPr>
-                <w:rFonts w:ascii="Times New Roman" w:hAnsi="Times New Roman" w:cs="Times New Roman"/>
-                <w:color w:val="4472C4" w:themeColor="accent5"/>
-                <w:sz w:val="24"/>
-                <w:szCs w:val="24"/>
-              </w:rPr>
-              <w:t xml:space="preserve">12 </w:t>
-            </w:r>
-            <w:r>
-              <w:rPr>
-                <w:rFonts w:ascii="Times New Roman" w:hAnsi="Times New Roman" w:cs="Times New Roman"/>
-                <w:color w:val="4472C4" w:themeColor="accent5"/>
-                <w:sz w:val="24"/>
-                <w:szCs w:val="24"/>
-              </w:rPr>
-              <w:t>- 216</w:t>
-            </w:r>
+                <w:sz w:val="24"/>
+                <w:szCs w:val="24"/>
+              </w:rPr>
+            </w:pPr>
           </w:p>
         </w:tc>
         <w:tc>
@@ -5800,39 +5302,6 @@
                 <w:szCs w:val="24"/>
               </w:rPr>
             </w:pPr>
-            <w:r>
-              <w:rPr>
-                <w:rFonts w:ascii="Times New Roman" w:hAnsi="Times New Roman" w:cs="Times New Roman"/>
-                <w:i/>
-                <w:iCs/>
-                <w:color w:val="7030A0"/>
-                <w:sz w:val="24"/>
-                <w:szCs w:val="24"/>
-              </w:rPr>
-              <w:t>Optional (</w:t>
-            </w:r>
-            <w:r>
-              <w:rPr>
-                <w:rFonts w:ascii="Times New Roman" w:hAnsi="Times New Roman" w:cs="Times New Roman"/>
-                <w:i/>
-                <w:iCs/>
-                <w:color w:val="7030A0"/>
-                <w:sz w:val="24"/>
-                <w:szCs w:val="24"/>
-              </w:rPr>
-              <w:t>Module 9 Video/Reading Quiz</w:t>
-            </w:r>
-            <w:r>
-              <w:rPr>
-                <w:rFonts w:ascii="Times New Roman" w:hAnsi="Times New Roman" w:cs="Times New Roman"/>
-                <w:i/>
-                <w:iCs/>
-                <w:color w:val="7030A0"/>
-                <w:sz w:val="24"/>
-                <w:szCs w:val="24"/>
-              </w:rPr>
-              <w:t>)</w:t>
-            </w:r>
           </w:p>
           <w:p>
             <w:pPr>
@@ -5922,15 +5391,7 @@
                 <w:sz w:val="24"/>
                 <w:szCs w:val="24"/>
               </w:rPr>
-              <w:t>Mon 10/1</w:t>
-            </w:r>
-            <w:r>
-              <w:rPr>
-                <w:rFonts w:ascii="Times New Roman" w:eastAsia="Times New Roman" w:hAnsi="Times New Roman" w:cs="Times New Roman"/>
-                <w:sz w:val="24"/>
-                <w:szCs w:val="24"/>
-              </w:rPr>
-              <w:t>9</w:t>
+              <w:t>Mon 10/19</w:t>
             </w:r>
           </w:p>
         </w:tc>
@@ -5956,18 +5417,11 @@
             <w:r>
               <w:rPr>
                 <w:rFonts w:ascii="Times New Roman" w:hAnsi="Times New Roman" w:cs="Times New Roman"/>
-                <w:sz w:val="24"/>
-                <w:szCs w:val="24"/>
-              </w:rPr>
-              <w:t>Module 8 and 9 Lab</w:t>
-            </w:r>
-            <w:r>
-              <w:rPr>
-                <w:rFonts w:ascii="Times New Roman" w:hAnsi="Times New Roman" w:cs="Times New Roman"/>
-                <w:sz w:val="24"/>
-                <w:szCs w:val="24"/>
-              </w:rPr>
-              <w:t>: Mushrooms</w:t>
+                <w:iCs/>
+                <w:sz w:val="24"/>
+                <w:szCs w:val="24"/>
+              </w:rPr>
+              <w:t>Activity 16: Winter Sports Helmet Use and Head Injuries</w:t>
             </w:r>
           </w:p>
         </w:tc>
@@ -5985,10 +5439,71 @@
             <w:pPr>
               <w:rPr>
                 <w:rFonts w:ascii="Times New Roman" w:hAnsi="Times New Roman" w:cs="Times New Roman"/>
-                <w:sz w:val="24"/>
-                <w:szCs w:val="24"/>
-              </w:rPr>
-            </w:pPr>
+                <w:color w:val="FF0000"/>
+                <w:sz w:val="24"/>
+                <w:szCs w:val="24"/>
+              </w:rPr>
+            </w:pPr>
+            <w:r>
+              <w:rPr>
+                <w:rFonts w:ascii="Times New Roman" w:eastAsia="Times New Roman" w:hAnsi="Times New Roman" w:cs="Times New Roman"/>
+                <w:color w:val="FF0000"/>
+                <w:sz w:val="24"/>
+              </w:rPr>
+              <w:t>§1</w:t>
+            </w:r>
+            <w:r>
+              <w:rPr>
+                <w:rFonts w:ascii="Times New Roman" w:hAnsi="Times New Roman" w:cs="Times New Roman"/>
+                <w:color w:val="FF0000"/>
+                <w:sz w:val="24"/>
+                <w:szCs w:val="24"/>
+              </w:rPr>
+              <w:t xml:space="preserve">5.3; </w:t>
+            </w:r>
+            <w:r>
+              <w:rPr>
+                <w:rFonts w:ascii="Times New Roman" w:eastAsia="Times New Roman" w:hAnsi="Times New Roman" w:cs="Times New Roman"/>
+                <w:color w:val="FF0000"/>
+                <w:sz w:val="24"/>
+              </w:rPr>
+              <w:t>§15.4</w:t>
+            </w:r>
+          </w:p>
+          <w:p>
+            <w:pPr>
+              <w:rPr>
+                <w:rFonts w:ascii="Times New Roman" w:hAnsi="Times New Roman" w:cs="Times New Roman"/>
+                <w:color w:val="00B050"/>
+                <w:sz w:val="24"/>
+              </w:rPr>
+            </w:pPr>
+            <w:r>
+              <w:rPr>
+                <w:rFonts w:ascii="Times New Roman" w:hAnsi="Times New Roman" w:cs="Times New Roman"/>
+                <w:color w:val="00B050"/>
+                <w:sz w:val="24"/>
+              </w:rPr>
+              <w:t>15.3TheoryTests, 15.3TheoryIntervals</w:t>
+            </w:r>
+          </w:p>
+          <w:p>
+            <w:pPr>
+              <w:rPr>
+                <w:rFonts w:ascii="Times New Roman" w:hAnsi="Times New Roman" w:cs="Times New Roman"/>
+                <w:sz w:val="24"/>
+                <w:szCs w:val="24"/>
+              </w:rPr>
+            </w:pPr>
+            <w:r>
+              <w:rPr>
+                <w:rFonts w:ascii="Times New Roman" w:hAnsi="Times New Roman" w:cs="Times New Roman"/>
+                <w:color w:val="4472C4" w:themeColor="accent5"/>
+                <w:sz w:val="24"/>
+                <w:szCs w:val="24"/>
+              </w:rPr>
+              <w:t>P. 212 - 216</w:t>
+            </w:r>
           </w:p>
         </w:tc>
         <w:tc>
@@ -6005,6 +5520,29 @@
             <w:pPr>
               <w:rPr>
                 <w:rFonts w:ascii="Times New Roman" w:hAnsi="Times New Roman" w:cs="Times New Roman"/>
+                <w:i/>
+                <w:iCs/>
+                <w:color w:val="7030A0"/>
+                <w:sz w:val="24"/>
+                <w:szCs w:val="24"/>
+              </w:rPr>
+            </w:pPr>
+            <w:r>
+              <w:rPr>
+                <w:rFonts w:ascii="Times New Roman" w:hAnsi="Times New Roman" w:cs="Times New Roman"/>
+                <w:i/>
+                <w:iCs/>
+                <w:color w:val="7030A0"/>
+                <w:sz w:val="24"/>
+                <w:szCs w:val="24"/>
+              </w:rPr>
+              <w:t>Optional (Module 9 Video/Reading Quiz)</w:t>
+            </w:r>
+          </w:p>
+          <w:p>
+            <w:pPr>
+              <w:rPr>
+                <w:rFonts w:ascii="Times New Roman" w:hAnsi="Times New Roman" w:cs="Times New Roman"/>
                 <w:color w:val="00B050"/>
                 <w:sz w:val="24"/>
                 <w:szCs w:val="24"/>
@@ -6027,34 +5565,6 @@
                 <w:szCs w:val="24"/>
               </w:rPr>
               <w:t xml:space="preserve"> 7 </w:t>
-            </w:r>
-          </w:p>
-          <w:p>
-            <w:pPr>
-              <w:rPr>
-                <w:rFonts w:ascii="Times New Roman" w:hAnsi="Times New Roman" w:cs="Times New Roman"/>
-                <w:color w:val="00B050"/>
-                <w:sz w:val="24"/>
-                <w:szCs w:val="24"/>
-              </w:rPr>
-            </w:pPr>
-            <w:r>
-              <w:rPr>
-                <w:rFonts w:ascii="Times New Roman" w:hAnsi="Times New Roman" w:cs="Times New Roman"/>
-                <w:color w:val="4472C4" w:themeColor="accent5"/>
-                <w:sz w:val="24"/>
-                <w:szCs w:val="24"/>
-              </w:rPr>
-              <w:t xml:space="preserve">Module 8 and 9 </w:t>
-            </w:r>
-            <w:r>
-              <w:rPr>
-                <w:rFonts w:ascii="Times New Roman" w:hAnsi="Times New Roman" w:cs="Times New Roman"/>
-                <w:color w:val="4472C4" w:themeColor="accent5"/>
-                <w:sz w:val="24"/>
-                <w:szCs w:val="24"/>
-              </w:rPr>
-              <w:t>Lab</w:t>
             </w:r>
           </w:p>
           <w:p>
@@ -6123,15 +5633,7 @@
                 <w:sz w:val="24"/>
                 <w:szCs w:val="24"/>
               </w:rPr>
-              <w:t>Wed 10/</w:t>
-            </w:r>
-            <w:r>
-              <w:rPr>
-                <w:rFonts w:ascii="Times New Roman" w:hAnsi="Times New Roman" w:cs="Times New Roman"/>
-                <w:sz w:val="24"/>
-                <w:szCs w:val="24"/>
-              </w:rPr>
-              <w:t>21</w:t>
+              <w:t>Wed 10/21</w:t>
             </w:r>
           </w:p>
         </w:tc>
@@ -6160,7 +5662,7 @@
                 <w:sz w:val="24"/>
                 <w:szCs w:val="24"/>
               </w:rPr>
-              <w:t>Special Topics</w:t>
+              <w:t>Module 8 and 9 Lab: Mushrooms</w:t>
             </w:r>
           </w:p>
         </w:tc>
@@ -6194,6 +5696,34 @@
               <w:right w:val="single" w:sz="4" w:space="0" w:color="000000"/>
             </w:tcBorders>
           </w:tcPr>
+          <w:p>
+            <w:pPr>
+              <w:rPr>
+                <w:rFonts w:ascii="Times New Roman" w:hAnsi="Times New Roman" w:cs="Times New Roman"/>
+                <w:color w:val="00B050"/>
+                <w:sz w:val="24"/>
+                <w:szCs w:val="24"/>
+              </w:rPr>
+            </w:pPr>
+            <w:r>
+              <w:rPr>
+                <w:rFonts w:ascii="Times New Roman" w:hAnsi="Times New Roman" w:cs="Times New Roman"/>
+                <w:color w:val="4472C4" w:themeColor="accent5"/>
+                <w:sz w:val="24"/>
+                <w:szCs w:val="24"/>
+              </w:rPr>
+              <w:t xml:space="preserve">Module 8 and 9 </w:t>
+            </w:r>
+            <w:r>
+              <w:rPr>
+                <w:rFonts w:ascii="Times New Roman" w:hAnsi="Times New Roman" w:cs="Times New Roman"/>
+                <w:color w:val="4472C4" w:themeColor="accent5"/>
+                <w:sz w:val="24"/>
+                <w:szCs w:val="24"/>
+              </w:rPr>
+              <w:t>Lab</w:t>
+            </w:r>
+          </w:p>
           <w:p>
             <w:pPr>
               <w:rPr>
@@ -6269,15 +5799,7 @@
                 <w:sz w:val="24"/>
                 <w:szCs w:val="24"/>
               </w:rPr>
-              <w:t>Fri 10/</w:t>
-            </w:r>
-            <w:r>
-              <w:rPr>
-                <w:rFonts w:ascii="Times New Roman" w:hAnsi="Times New Roman" w:cs="Times New Roman"/>
-                <w:sz w:val="24"/>
-                <w:szCs w:val="24"/>
-              </w:rPr>
-              <w:t>23</w:t>
+              <w:t>Fri 10/23</w:t>
             </w:r>
           </w:p>
         </w:tc>
@@ -6302,11 +5824,19 @@
             </w:pPr>
             <w:r>
               <w:rPr>
-                <w:rFonts w:ascii="Times New Roman" w:eastAsia="Times New Roman" w:hAnsi="Times New Roman" w:cs="Times New Roman"/>
-                <w:sz w:val="24"/>
-                <w:szCs w:val="24"/>
-              </w:rPr>
-              <w:t>Exam 2 Review</w:t>
+                <w:rFonts w:ascii="Times New Roman" w:hAnsi="Times New Roman" w:cs="Times New Roman"/>
+                <w:sz w:val="24"/>
+                <w:szCs w:val="24"/>
+              </w:rPr>
+              <w:t>Special Topics</w:t>
+            </w:r>
+            <w:r>
+              <w:rPr>
+                <w:rFonts w:ascii="Times New Roman" w:hAnsi="Times New Roman" w:cs="Times New Roman"/>
+                <w:sz w:val="24"/>
+                <w:szCs w:val="24"/>
+              </w:rPr>
+              <w:t>: Relative Risk</w:t>
             </w:r>
           </w:p>
         </w:tc>
@@ -6373,29 +5903,20 @@
           <w:p>
             <w:pPr>
               <w:rPr>
-                <w:rFonts w:ascii="Times New Roman" w:hAnsi="Times New Roman" w:cs="Times New Roman"/>
-                <w:b/>
-                <w:sz w:val="24"/>
-                <w:szCs w:val="24"/>
-              </w:rPr>
-            </w:pPr>
-            <w:r>
-              <w:rPr>
-                <w:rFonts w:ascii="Times New Roman" w:eastAsia="Times New Roman" w:hAnsi="Times New Roman" w:cs="Times New Roman"/>
-                <w:b/>
-                <w:sz w:val="24"/>
-                <w:szCs w:val="24"/>
-              </w:rPr>
-              <w:t>1</w:t>
-            </w:r>
-            <w:r>
-              <w:rPr>
-                <w:rFonts w:ascii="Times New Roman" w:eastAsia="Times New Roman" w:hAnsi="Times New Roman" w:cs="Times New Roman"/>
-                <w:b/>
-                <w:sz w:val="24"/>
-                <w:szCs w:val="24"/>
-              </w:rPr>
-              <w:t>0</w:t>
+                <w:rFonts w:ascii="Times New Roman" w:eastAsia="Times New Roman" w:hAnsi="Times New Roman" w:cs="Times New Roman"/>
+                <w:b/>
+                <w:sz w:val="24"/>
+                <w:szCs w:val="24"/>
+              </w:rPr>
+            </w:pPr>
+            <w:r>
+              <w:rPr>
+                <w:rFonts w:ascii="Times New Roman" w:eastAsia="Times New Roman" w:hAnsi="Times New Roman" w:cs="Times New Roman"/>
+                <w:b/>
+                <w:sz w:val="24"/>
+                <w:szCs w:val="24"/>
+              </w:rPr>
+              <w:t>10</w:t>
             </w:r>
           </w:p>
         </w:tc>
@@ -6424,15 +5945,7 @@
                 <w:sz w:val="24"/>
                 <w:szCs w:val="24"/>
               </w:rPr>
-              <w:t>Mon 10/2</w:t>
-            </w:r>
-            <w:r>
-              <w:rPr>
-                <w:rFonts w:ascii="Times New Roman" w:hAnsi="Times New Roman" w:cs="Times New Roman"/>
-                <w:sz w:val="24"/>
-                <w:szCs w:val="24"/>
-              </w:rPr>
-              <w:t>6</w:t>
+              <w:t>Mon 10/26</w:t>
             </w:r>
           </w:p>
         </w:tc>
@@ -6449,13 +5962,6 @@
           <w:p>
             <w:pPr>
               <w:ind w:left="5"/>
-              <w:rPr>
-                <w:rFonts w:ascii="Times New Roman" w:eastAsia="Times New Roman" w:hAnsi="Times New Roman" w:cs="Times New Roman"/>
-                <w:sz w:val="24"/>
-                <w:szCs w:val="24"/>
-              </w:rPr>
-            </w:pPr>
-            <w:r>
               <w:rPr>
                 <w:rFonts w:ascii="Times New Roman" w:eastAsia="Times New Roman" w:hAnsi="Times New Roman" w:cs="Times New Roman"/>
                 <w:b/>
@@ -6465,8 +5971,7 @@
                 <w:szCs w:val="24"/>
                 <w:highlight w:val="yellow"/>
               </w:rPr>
-              <w:t xml:space="preserve">Group </w:t>
-            </w:r>
+            </w:pPr>
             <w:r>
               <w:rPr>
                 <w:rFonts w:ascii="Times New Roman" w:eastAsia="Times New Roman" w:hAnsi="Times New Roman" w:cs="Times New Roman"/>
@@ -6475,9 +5980,8 @@
                 <w:color w:val="auto"/>
                 <w:sz w:val="24"/>
                 <w:szCs w:val="24"/>
-                <w:highlight w:val="yellow"/>
-              </w:rPr>
-              <w:t>Midterm Exam 2</w:t>
+              </w:rPr>
+              <w:t>Exam 2 Review</w:t>
             </w:r>
           </w:p>
         </w:tc>
@@ -6578,15 +6082,7 @@
                 <w:sz w:val="24"/>
                 <w:szCs w:val="24"/>
               </w:rPr>
-              <w:t>Wed 10/2</w:t>
-            </w:r>
-            <w:r>
-              <w:rPr>
-                <w:rFonts w:ascii="Times New Roman" w:hAnsi="Times New Roman" w:cs="Times New Roman"/>
-                <w:sz w:val="24"/>
-                <w:szCs w:val="24"/>
-              </w:rPr>
-              <w:t>8</w:t>
+              <w:t>Wed 10/28</w:t>
             </w:r>
           </w:p>
         </w:tc>
@@ -6615,7 +6111,7 @@
             </w:pPr>
             <w:r>
               <w:rPr>
-                <w:rFonts w:ascii="Times New Roman" w:hAnsi="Times New Roman" w:cs="Times New Roman"/>
+                <w:rFonts w:ascii="Times New Roman" w:eastAsia="Times New Roman" w:hAnsi="Times New Roman" w:cs="Times New Roman"/>
                 <w:b/>
                 <w:bCs/>
                 <w:color w:val="auto"/>
@@ -6623,7 +6119,19 @@
                 <w:szCs w:val="24"/>
                 <w:highlight w:val="yellow"/>
               </w:rPr>
-              <w:t>Individual Midterm Exam 2</w:t>
+              <w:t xml:space="preserve">Group </w:t>
+            </w:r>
+            <w:r>
+              <w:rPr>
+                <w:rFonts w:ascii="Times New Roman" w:eastAsia="Times New Roman" w:hAnsi="Times New Roman" w:cs="Times New Roman"/>
+                <w:b/>
+                <w:bCs/>
+                <w:color w:val="auto"/>
+                <w:sz w:val="24"/>
+                <w:szCs w:val="24"/>
+                <w:highlight w:val="yellow"/>
+              </w:rPr>
+              <w:t>Midterm Exam 2</w:t>
             </w:r>
           </w:p>
         </w:tc>
@@ -6703,7 +6211,6 @@
                 <w:sz w:val="24"/>
                 <w:szCs w:val="24"/>
               </w:rPr>
-              <w:lastRenderedPageBreak/>
               <w:t xml:space="preserve"> </w:t>
             </w:r>
           </w:p>
@@ -6735,22 +6242,48 @@
                 <w:sz w:val="24"/>
                 <w:szCs w:val="24"/>
               </w:rPr>
-              <w:t>Fri 10/</w:t>
-            </w:r>
-            <w:r>
+              <w:t>Fri 10/30</w:t>
+            </w:r>
+          </w:p>
+        </w:tc>
+        <w:tc>
+          <w:tcPr>
+            <w:tcW w:w="3690" w:type="dxa"/>
+            <w:tcBorders>
+              <w:top w:val="single" w:sz="4" w:space="0" w:color="000000"/>
+              <w:left w:val="single" w:sz="4" w:space="0" w:color="000000"/>
+              <w:bottom w:val="double" w:sz="4" w:space="0" w:color="000000"/>
+              <w:right w:val="single" w:sz="4" w:space="0" w:color="000000"/>
+            </w:tcBorders>
+          </w:tcPr>
+          <w:p>
+            <w:pPr>
+              <w:ind w:left="5"/>
               <w:rPr>
                 <w:rFonts w:ascii="Times New Roman" w:hAnsi="Times New Roman" w:cs="Times New Roman"/>
                 <w:color w:val="auto"/>
                 <w:sz w:val="24"/>
                 <w:szCs w:val="24"/>
-              </w:rPr>
-              <w:t>30</w:t>
-            </w:r>
-          </w:p>
-        </w:tc>
-        <w:tc>
-          <w:tcPr>
-            <w:tcW w:w="3690" w:type="dxa"/>
+                <w:highlight w:val="yellow"/>
+              </w:rPr>
+            </w:pPr>
+            <w:r>
+              <w:rPr>
+                <w:rFonts w:ascii="Times New Roman" w:hAnsi="Times New Roman" w:cs="Times New Roman"/>
+                <w:b/>
+                <w:bCs/>
+                <w:color w:val="auto"/>
+                <w:sz w:val="24"/>
+                <w:szCs w:val="24"/>
+                <w:highlight w:val="yellow"/>
+              </w:rPr>
+              <w:t>Individual Midterm Exam 2</w:t>
+            </w:r>
+          </w:p>
+        </w:tc>
+        <w:tc>
+          <w:tcPr>
+            <w:tcW w:w="2340" w:type="dxa"/>
             <w:tcBorders>
               <w:top w:val="single" w:sz="4" w:space="0" w:color="000000"/>
               <w:left w:val="single" w:sz="4" w:space="0" w:color="000000"/>
@@ -6760,29 +6293,17 @@
           </w:tcPr>
           <w:p>
             <w:pPr>
-              <w:ind w:left="5"/>
-              <w:rPr>
-                <w:rFonts w:ascii="Times New Roman" w:hAnsi="Times New Roman" w:cs="Times New Roman"/>
-                <w:color w:val="auto"/>
-                <w:sz w:val="24"/>
-                <w:szCs w:val="24"/>
-                <w:highlight w:val="yellow"/>
-              </w:rPr>
-            </w:pPr>
-            <w:r>
-              <w:rPr>
-                <w:rFonts w:ascii="Times New Roman" w:hAnsi="Times New Roman" w:cs="Times New Roman"/>
-                <w:iCs/>
-                <w:sz w:val="24"/>
-                <w:szCs w:val="24"/>
-              </w:rPr>
-              <w:t>Activity 17: Does behavior impact performance?</w:t>
-            </w:r>
-          </w:p>
-        </w:tc>
-        <w:tc>
-          <w:tcPr>
-            <w:tcW w:w="2340" w:type="dxa"/>
+              <w:rPr>
+                <w:rFonts w:ascii="Times New Roman" w:hAnsi="Times New Roman" w:cs="Times New Roman"/>
+                <w:sz w:val="24"/>
+                <w:szCs w:val="24"/>
+              </w:rPr>
+            </w:pPr>
+          </w:p>
+        </w:tc>
+        <w:tc>
+          <w:tcPr>
+            <w:tcW w:w="2344" w:type="dxa"/>
             <w:tcBorders>
               <w:top w:val="single" w:sz="4" w:space="0" w:color="000000"/>
               <w:left w:val="single" w:sz="4" w:space="0" w:color="000000"/>
@@ -6793,132 +6314,11 @@
           <w:p>
             <w:pPr>
               <w:rPr>
-                <w:rFonts w:ascii="Times New Roman" w:eastAsia="Times New Roman" w:hAnsi="Times New Roman" w:cs="Times New Roman"/>
-                <w:color w:val="FF0000"/>
-                <w:sz w:val="24"/>
-              </w:rPr>
-            </w:pPr>
-            <w:r>
-              <w:rPr>
-                <w:rFonts w:ascii="Times New Roman" w:eastAsia="Times New Roman" w:hAnsi="Times New Roman" w:cs="Times New Roman"/>
-                <w:color w:val="FF0000"/>
-                <w:sz w:val="24"/>
-              </w:rPr>
-              <w:t>§</w:t>
-            </w:r>
-            <w:r>
-              <w:rPr>
-                <w:rFonts w:ascii="Times New Roman" w:hAnsi="Times New Roman" w:cs="Times New Roman"/>
-                <w:color w:val="FF0000"/>
-                <w:sz w:val="24"/>
-              </w:rPr>
-              <w:t>5.6</w:t>
-            </w:r>
-            <w:r>
-              <w:rPr>
-                <w:rFonts w:ascii="Times New Roman" w:hAnsi="Times New Roman" w:cs="Times New Roman"/>
-                <w:color w:val="FF0000"/>
-                <w:sz w:val="24"/>
-                <w:szCs w:val="24"/>
-              </w:rPr>
-              <w:t xml:space="preserve">; </w:t>
-            </w:r>
-            <w:r>
-              <w:rPr>
-                <w:rFonts w:ascii="Times New Roman" w:eastAsia="Times New Roman" w:hAnsi="Times New Roman" w:cs="Times New Roman"/>
-                <w:color w:val="FF0000"/>
-                <w:sz w:val="24"/>
-              </w:rPr>
-              <w:t>Ch 19; Ch 20</w:t>
-            </w:r>
-          </w:p>
-          <w:p>
-            <w:pPr>
-              <w:rPr>
-                <w:rFonts w:ascii="Times New Roman" w:hAnsi="Times New Roman" w:cs="Times New Roman"/>
-                <w:color w:val="00B050"/>
-                <w:sz w:val="24"/>
-              </w:rPr>
-            </w:pPr>
-            <w:r>
-              <w:rPr>
-                <w:rFonts w:ascii="Times New Roman" w:hAnsi="Times New Roman" w:cs="Times New Roman"/>
-                <w:color w:val="00B050"/>
-                <w:sz w:val="24"/>
-              </w:rPr>
-              <w:t>5.6, 19.1, 19.2, 19.3TheoryTests, 19.3TheoryInterval</w:t>
-            </w:r>
-          </w:p>
-          <w:p>
-            <w:pPr>
-              <w:rPr>
-                <w:rFonts w:ascii="Times New Roman" w:hAnsi="Times New Roman" w:cs="Times New Roman"/>
-                <w:sz w:val="24"/>
-                <w:szCs w:val="24"/>
-              </w:rPr>
-            </w:pPr>
-            <w:r>
-              <w:rPr>
-                <w:rFonts w:ascii="Times New Roman" w:hAnsi="Times New Roman" w:cs="Times New Roman"/>
-                <w:color w:val="4472C4" w:themeColor="accent5"/>
-                <w:sz w:val="24"/>
-                <w:szCs w:val="24"/>
-              </w:rPr>
-              <w:t>P. 252 - 260</w:t>
-            </w:r>
-          </w:p>
-        </w:tc>
-        <w:tc>
-          <w:tcPr>
-            <w:tcW w:w="2344" w:type="dxa"/>
-            <w:tcBorders>
-              <w:top w:val="single" w:sz="4" w:space="0" w:color="000000"/>
-              <w:left w:val="single" w:sz="4" w:space="0" w:color="000000"/>
-              <w:bottom w:val="double" w:sz="4" w:space="0" w:color="000000"/>
-              <w:right w:val="single" w:sz="4" w:space="0" w:color="000000"/>
-            </w:tcBorders>
-          </w:tcPr>
-          <w:p>
-            <w:pPr>
-              <w:rPr>
-                <w:rFonts w:ascii="Times New Roman" w:hAnsi="Times New Roman" w:cs="Times New Roman"/>
-                <w:sz w:val="24"/>
-                <w:szCs w:val="24"/>
-              </w:rPr>
-            </w:pPr>
-            <w:r>
-              <w:rPr>
-                <w:rFonts w:ascii="Times New Roman" w:hAnsi="Times New Roman" w:cs="Times New Roman"/>
-                <w:i/>
-                <w:iCs/>
-                <w:color w:val="7030A0"/>
-                <w:sz w:val="24"/>
-                <w:szCs w:val="24"/>
-              </w:rPr>
-              <w:t>Optional (</w:t>
-            </w:r>
-            <w:r>
-              <w:rPr>
-                <w:rFonts w:ascii="Times New Roman" w:hAnsi="Times New Roman" w:cs="Times New Roman"/>
-                <w:i/>
-                <w:iCs/>
-                <w:color w:val="7030A0"/>
-                <w:sz w:val="24"/>
-                <w:szCs w:val="24"/>
-              </w:rPr>
-              <w:t>Module 11 Video/Reading Quiz</w:t>
-            </w:r>
-            <w:r>
-              <w:rPr>
-                <w:rFonts w:ascii="Times New Roman" w:hAnsi="Times New Roman" w:cs="Times New Roman"/>
-                <w:i/>
-                <w:iCs/>
-                <w:color w:val="7030A0"/>
-                <w:sz w:val="24"/>
-                <w:szCs w:val="24"/>
-              </w:rPr>
-              <w:t>)</w:t>
-            </w:r>
+                <w:rFonts w:ascii="Times New Roman" w:hAnsi="Times New Roman" w:cs="Times New Roman"/>
+                <w:sz w:val="24"/>
+                <w:szCs w:val="24"/>
+              </w:rPr>
+            </w:pPr>
           </w:p>
         </w:tc>
       </w:tr>
@@ -6957,6 +6357,7 @@
                 <w:sz w:val="24"/>
                 <w:szCs w:val="24"/>
               </w:rPr>
+              <w:lastRenderedPageBreak/>
               <w:t>1</w:t>
             </w:r>
             <w:r>
@@ -6995,15 +6396,7 @@
                 <w:sz w:val="24"/>
                 <w:szCs w:val="24"/>
               </w:rPr>
-              <w:t>Mon 1</w:t>
-            </w:r>
-            <w:r>
-              <w:rPr>
-                <w:rFonts w:ascii="Times New Roman" w:eastAsia="Times New Roman" w:hAnsi="Times New Roman" w:cs="Times New Roman"/>
-                <w:sz w:val="24"/>
-                <w:szCs w:val="24"/>
-              </w:rPr>
-              <w:t>1/2</w:t>
+              <w:t>Mon 11/2</w:t>
             </w:r>
           </w:p>
         </w:tc>
@@ -7030,10 +6423,11 @@
             <w:r>
               <w:rPr>
                 <w:rFonts w:ascii="Times New Roman" w:hAnsi="Times New Roman" w:cs="Times New Roman"/>
-                <w:sz w:val="24"/>
-                <w:szCs w:val="24"/>
-              </w:rPr>
-              <w:t>Activity 18: Moon Phases and Virtual Reality</w:t>
+                <w:iCs/>
+                <w:sz w:val="24"/>
+                <w:szCs w:val="24"/>
+              </w:rPr>
+              <w:t>Activity 17: Does behavior impact performance?</w:t>
             </w:r>
           </w:p>
         </w:tc>
@@ -7049,6 +6443,65 @@
           </w:tcPr>
           <w:p>
             <w:pPr>
+              <w:rPr>
+                <w:rFonts w:ascii="Times New Roman" w:eastAsia="Times New Roman" w:hAnsi="Times New Roman" w:cs="Times New Roman"/>
+                <w:color w:val="FF0000"/>
+                <w:sz w:val="24"/>
+              </w:rPr>
+            </w:pPr>
+            <w:r>
+              <w:rPr>
+                <w:rFonts w:ascii="Times New Roman" w:eastAsia="Times New Roman" w:hAnsi="Times New Roman" w:cs="Times New Roman"/>
+                <w:color w:val="FF0000"/>
+                <w:sz w:val="24"/>
+              </w:rPr>
+              <w:t>§</w:t>
+            </w:r>
+            <w:r>
+              <w:rPr>
+                <w:rFonts w:ascii="Times New Roman" w:hAnsi="Times New Roman" w:cs="Times New Roman"/>
+                <w:color w:val="FF0000"/>
+                <w:sz w:val="24"/>
+              </w:rPr>
+              <w:t>5.6</w:t>
+            </w:r>
+            <w:r>
+              <w:rPr>
+                <w:rFonts w:ascii="Times New Roman" w:hAnsi="Times New Roman" w:cs="Times New Roman"/>
+                <w:color w:val="FF0000"/>
+                <w:sz w:val="24"/>
+                <w:szCs w:val="24"/>
+              </w:rPr>
+              <w:t xml:space="preserve">; </w:t>
+            </w:r>
+            <w:r>
+              <w:rPr>
+                <w:rFonts w:ascii="Times New Roman" w:eastAsia="Times New Roman" w:hAnsi="Times New Roman" w:cs="Times New Roman"/>
+                <w:color w:val="FF0000"/>
+                <w:sz w:val="24"/>
+              </w:rPr>
+              <w:t>Ch 19; Ch 20</w:t>
+            </w:r>
+          </w:p>
+          <w:p>
+            <w:pPr>
+              <w:rPr>
+                <w:rFonts w:ascii="Times New Roman" w:hAnsi="Times New Roman" w:cs="Times New Roman"/>
+                <w:color w:val="00B050"/>
+                <w:sz w:val="24"/>
+              </w:rPr>
+            </w:pPr>
+            <w:r>
+              <w:rPr>
+                <w:rFonts w:ascii="Times New Roman" w:hAnsi="Times New Roman" w:cs="Times New Roman"/>
+                <w:color w:val="00B050"/>
+                <w:sz w:val="24"/>
+              </w:rPr>
+              <w:t>5.6, 19.1, 19.2, 19.3TheoryTests, 19.3TheoryInterval</w:t>
+            </w:r>
+          </w:p>
+          <w:p>
+            <w:pPr>
               <w:ind w:right="29"/>
               <w:rPr>
                 <w:rFonts w:ascii="Times New Roman" w:hAnsi="Times New Roman" w:cs="Times New Roman"/>
@@ -7057,6 +6510,15 @@
                 <w:szCs w:val="24"/>
               </w:rPr>
             </w:pPr>
+            <w:r>
+              <w:rPr>
+                <w:rFonts w:ascii="Times New Roman" w:hAnsi="Times New Roman" w:cs="Times New Roman"/>
+                <w:color w:val="4472C4" w:themeColor="accent5"/>
+                <w:sz w:val="24"/>
+                <w:szCs w:val="24"/>
+              </w:rPr>
+              <w:t>P. 252 - 260</w:t>
+            </w:r>
           </w:p>
         </w:tc>
         <w:tc>
@@ -7073,47 +6535,21 @@
             <w:pPr>
               <w:rPr>
                 <w:rFonts w:ascii="Times New Roman" w:eastAsia="Times New Roman" w:hAnsi="Times New Roman" w:cs="Times New Roman"/>
-                <w:color w:val="0070C0"/>
-                <w:sz w:val="24"/>
-                <w:szCs w:val="24"/>
-              </w:rPr>
-            </w:pPr>
-            <w:r>
-              <w:rPr>
-                <w:rFonts w:ascii="Times New Roman" w:hAnsi="Times New Roman" w:cs="Times New Roman"/>
-                <w:color w:val="00B050"/>
-                <w:sz w:val="24"/>
-                <w:szCs w:val="24"/>
-              </w:rPr>
-              <w:t xml:space="preserve">Assignment </w:t>
-            </w:r>
-            <w:r>
-              <w:rPr>
-                <w:rFonts w:ascii="Times New Roman" w:hAnsi="Times New Roman" w:cs="Times New Roman"/>
-                <w:color w:val="00B050"/>
-                <w:sz w:val="24"/>
-                <w:szCs w:val="24"/>
-              </w:rPr>
-              <w:t>8</w:t>
-            </w:r>
-            <w:r>
-              <w:rPr>
-                <w:rFonts w:ascii="Times New Roman" w:hAnsi="Times New Roman" w:cs="Times New Roman"/>
-                <w:color w:val="00B050"/>
-                <w:sz w:val="24"/>
-                <w:szCs w:val="24"/>
-              </w:rPr>
-              <w:t xml:space="preserve"> </w:t>
-            </w:r>
-          </w:p>
-          <w:p>
-            <w:pPr>
-              <w:rPr>
-                <w:rFonts w:ascii="Times New Roman" w:eastAsia="Times New Roman" w:hAnsi="Times New Roman" w:cs="Times New Roman"/>
-                <w:sz w:val="24"/>
-                <w:szCs w:val="24"/>
-              </w:rPr>
-            </w:pPr>
+                <w:sz w:val="24"/>
+                <w:szCs w:val="24"/>
+              </w:rPr>
+            </w:pPr>
+            <w:r>
+              <w:rPr>
+                <w:rFonts w:ascii="Times New Roman" w:hAnsi="Times New Roman" w:cs="Times New Roman"/>
+                <w:i/>
+                <w:iCs/>
+                <w:color w:val="7030A0"/>
+                <w:sz w:val="24"/>
+                <w:szCs w:val="24"/>
+              </w:rPr>
+              <w:t>Optional (Module 11 Video/Reading Quiz)</w:t>
+            </w:r>
           </w:p>
         </w:tc>
       </w:tr>
@@ -7181,15 +6617,7 @@
                 <w:sz w:val="24"/>
                 <w:szCs w:val="24"/>
               </w:rPr>
-              <w:t>Wed 1</w:t>
-            </w:r>
-            <w:r>
-              <w:rPr>
-                <w:rFonts w:ascii="Times New Roman" w:hAnsi="Times New Roman" w:cs="Times New Roman"/>
-                <w:sz w:val="24"/>
-                <w:szCs w:val="24"/>
-              </w:rPr>
-              <w:t>1/4</w:t>
+              <w:t>Wed 11/4</w:t>
             </w:r>
           </w:p>
         </w:tc>
@@ -7219,31 +6647,7 @@
                 <w:sz w:val="24"/>
                 <w:szCs w:val="24"/>
               </w:rPr>
-              <w:t>Module 1</w:t>
-            </w:r>
-            <w:r>
-              <w:rPr>
-                <w:rFonts w:ascii="Times New Roman" w:hAnsi="Times New Roman" w:cs="Times New Roman"/>
-                <w:sz w:val="24"/>
-                <w:szCs w:val="24"/>
-              </w:rPr>
-              <w:t>1</w:t>
-            </w:r>
-            <w:r>
-              <w:rPr>
-                <w:rFonts w:ascii="Times New Roman" w:hAnsi="Times New Roman" w:cs="Times New Roman"/>
-                <w:sz w:val="24"/>
-                <w:szCs w:val="24"/>
-              </w:rPr>
-              <w:t xml:space="preserve"> Lab: </w:t>
-            </w:r>
-            <w:r>
-              <w:rPr>
-                <w:rFonts w:ascii="Times New Roman" w:hAnsi="Times New Roman" w:cs="Times New Roman"/>
-                <w:sz w:val="24"/>
-                <w:szCs w:val="24"/>
-              </w:rPr>
-              <w:t>Dinosaurs</w:t>
+              <w:t>Activity 18: Moon Phases and Virtual Reality</w:t>
             </w:r>
           </w:p>
         </w:tc>
@@ -7289,21 +6693,30 @@
             </w:pPr>
             <w:r>
               <w:rPr>
-                <w:rFonts w:ascii="Times New Roman" w:eastAsia="Times New Roman" w:hAnsi="Times New Roman" w:cs="Times New Roman"/>
-                <w:color w:val="0070C0"/>
-                <w:sz w:val="24"/>
-                <w:szCs w:val="24"/>
-              </w:rPr>
-              <w:t>Module 11</w:t>
-            </w:r>
-            <w:r>
-              <w:rPr>
-                <w:rFonts w:ascii="Times New Roman" w:eastAsia="Times New Roman" w:hAnsi="Times New Roman" w:cs="Times New Roman"/>
-                <w:color w:val="0070C0"/>
-                <w:sz w:val="24"/>
-                <w:szCs w:val="24"/>
-              </w:rPr>
-              <w:t xml:space="preserve"> Lab</w:t>
+                <w:rFonts w:ascii="Times New Roman" w:hAnsi="Times New Roman" w:cs="Times New Roman"/>
+                <w:color w:val="00B050"/>
+                <w:sz w:val="24"/>
+                <w:szCs w:val="24"/>
+              </w:rPr>
+              <w:t xml:space="preserve">Assignment </w:t>
+            </w:r>
+            <w:r>
+              <w:rPr>
+                <w:rFonts w:ascii="Times New Roman" w:hAnsi="Times New Roman" w:cs="Times New Roman"/>
+                <w:color w:val="00B050"/>
+                <w:sz w:val="24"/>
+                <w:szCs w:val="24"/>
+              </w:rPr>
+              <w:t>8</w:t>
+            </w:r>
+            <w:r>
+              <w:rPr>
+                <w:rFonts w:ascii="Times New Roman" w:hAnsi="Times New Roman" w:cs="Times New Roman"/>
+                <w:color w:val="00B050"/>
+                <w:sz w:val="24"/>
+                <w:szCs w:val="24"/>
+              </w:rPr>
+              <w:t xml:space="preserve"> </w:t>
             </w:r>
           </w:p>
           <w:p>
@@ -7381,15 +6794,7 @@
                 <w:sz w:val="24"/>
                 <w:szCs w:val="24"/>
               </w:rPr>
-              <w:t xml:space="preserve">Fri </w:t>
-            </w:r>
-            <w:r>
-              <w:rPr>
-                <w:rFonts w:ascii="Times New Roman" w:hAnsi="Times New Roman" w:cs="Times New Roman"/>
-                <w:sz w:val="24"/>
-                <w:szCs w:val="24"/>
-              </w:rPr>
-              <w:t>11/6</w:t>
+              <w:t>Fri 11/6</w:t>
             </w:r>
           </w:p>
         </w:tc>
@@ -7419,20 +6824,34 @@
             <w:r>
               <w:rPr>
                 <w:rFonts w:ascii="Times New Roman" w:hAnsi="Times New Roman" w:cs="Times New Roman"/>
-                <w:iCs/>
-                <w:sz w:val="24"/>
-                <w:szCs w:val="24"/>
-              </w:rPr>
-              <w:t xml:space="preserve">Activity 19: </w:t>
-            </w:r>
-            <w:r>
-              <w:rPr>
-                <w:rFonts w:ascii="Times New Roman" w:hAnsi="Times New Roman" w:cs="Times New Roman"/>
-                <w:iCs/>
-                <w:sz w:val="24"/>
-                <w:szCs w:val="24"/>
-              </w:rPr>
-              <w:t>IPEDS (continued) – Linear Regression</w:t>
+                <w:sz w:val="24"/>
+                <w:szCs w:val="24"/>
+              </w:rPr>
+              <w:t>Module 1</w:t>
+            </w:r>
+            <w:r>
+              <w:rPr>
+                <w:rFonts w:ascii="Times New Roman" w:hAnsi="Times New Roman" w:cs="Times New Roman"/>
+                <w:sz w:val="24"/>
+                <w:szCs w:val="24"/>
+              </w:rPr>
+              <w:t>1</w:t>
+            </w:r>
+            <w:r>
+              <w:rPr>
+                <w:rFonts w:ascii="Times New Roman" w:hAnsi="Times New Roman" w:cs="Times New Roman"/>
+                <w:sz w:val="24"/>
+                <w:szCs w:val="24"/>
+              </w:rPr>
+              <w:t xml:space="preserve"> Lab: </w:t>
+            </w:r>
+            <w:r>
+              <w:rPr>
+                <w:rFonts w:ascii="Times New Roman" w:hAnsi="Times New Roman" w:cs="Times New Roman"/>
+                <w:sz w:val="24"/>
+                <w:szCs w:val="24"/>
+              </w:rPr>
+              <w:t>Dinosaurs</w:t>
             </w:r>
           </w:p>
         </w:tc>
@@ -7450,80 +6869,10 @@
             <w:pPr>
               <w:rPr>
                 <w:rFonts w:ascii="Times New Roman" w:hAnsi="Times New Roman" w:cs="Times New Roman"/>
-                <w:color w:val="FF0000"/>
-                <w:sz w:val="24"/>
-                <w:szCs w:val="24"/>
-              </w:rPr>
-            </w:pPr>
-            <w:r>
-              <w:rPr>
-                <w:rFonts w:ascii="Times New Roman" w:eastAsia="Times New Roman" w:hAnsi="Times New Roman" w:cs="Times New Roman"/>
-                <w:color w:val="FF0000"/>
-                <w:sz w:val="24"/>
-              </w:rPr>
-              <w:t xml:space="preserve">Ch 6; Ch 7; Ch 8; </w:t>
-            </w:r>
-            <w:r>
-              <w:rPr>
-                <w:rFonts w:ascii="Times New Roman" w:eastAsia="Times New Roman" w:hAnsi="Times New Roman" w:cs="Times New Roman"/>
-                <w:color w:val="FF0000"/>
-                <w:sz w:val="24"/>
-              </w:rPr>
-              <w:t>Ch 21; Ch 22</w:t>
-            </w:r>
-          </w:p>
-          <w:p>
-            <w:pPr>
-              <w:rPr>
-                <w:rFonts w:ascii="Times New Roman" w:eastAsia="Times New Roman" w:hAnsi="Times New Roman" w:cs="Times New Roman"/>
-                <w:color w:val="FF0000"/>
-                <w:sz w:val="24"/>
-              </w:rPr>
-            </w:pPr>
-            <w:r>
-              <w:rPr>
-                <w:rFonts w:ascii="Times New Roman" w:hAnsi="Times New Roman" w:cs="Times New Roman"/>
-                <w:color w:val="00B050"/>
-                <w:sz w:val="24"/>
-              </w:rPr>
-              <w:t>6.1, 6.2, 6.3, Ch 7, Ch21_Overview, 21.1, 21.3, 21.4TheoryTests, 21.4TheoryIntervals</w:t>
-            </w:r>
-          </w:p>
-          <w:p>
-            <w:pPr>
-              <w:rPr>
-                <w:rFonts w:ascii="Times New Roman" w:hAnsi="Times New Roman" w:cs="Times New Roman"/>
-                <w:sz w:val="24"/>
-                <w:szCs w:val="24"/>
-              </w:rPr>
-            </w:pPr>
-            <w:r>
-              <w:rPr>
-                <w:rFonts w:ascii="Times New Roman" w:hAnsi="Times New Roman" w:cs="Times New Roman"/>
-                <w:color w:val="4472C4" w:themeColor="accent5"/>
-                <w:sz w:val="24"/>
-                <w:szCs w:val="24"/>
-              </w:rPr>
-              <w:t>P. 281 - 2</w:t>
-            </w:r>
-            <w:r>
-              <w:rPr>
-                <w:rFonts w:ascii="Times New Roman" w:hAnsi="Times New Roman" w:cs="Times New Roman"/>
-                <w:color w:val="4472C4" w:themeColor="accent5"/>
-                <w:sz w:val="24"/>
-                <w:szCs w:val="24"/>
-              </w:rPr>
-              <w:t>9</w:t>
-            </w:r>
-            <w:r>
-              <w:rPr>
-                <w:rFonts w:ascii="Times New Roman" w:hAnsi="Times New Roman" w:cs="Times New Roman"/>
-                <w:color w:val="4472C4" w:themeColor="accent5"/>
-                <w:sz w:val="24"/>
-                <w:szCs w:val="24"/>
-              </w:rPr>
-              <w:t>8</w:t>
-            </w:r>
+                <w:sz w:val="24"/>
+                <w:szCs w:val="24"/>
+              </w:rPr>
+            </w:pPr>
           </w:p>
         </w:tc>
         <w:tc>
@@ -7539,46 +6888,29 @@
           <w:p>
             <w:pPr>
               <w:rPr>
-                <w:rFonts w:ascii="Times New Roman" w:hAnsi="Times New Roman" w:cs="Times New Roman"/>
-                <w:i/>
-                <w:iCs/>
-                <w:color w:val="7030A0"/>
-                <w:sz w:val="24"/>
-                <w:szCs w:val="24"/>
-              </w:rPr>
-            </w:pPr>
-            <w:r>
-              <w:rPr>
-                <w:rFonts w:ascii="Times New Roman" w:hAnsi="Times New Roman" w:cs="Times New Roman"/>
-                <w:i/>
-                <w:iCs/>
-                <w:color w:val="7030A0"/>
-                <w:sz w:val="24"/>
-                <w:szCs w:val="24"/>
-              </w:rPr>
-              <w:t>Optional (</w:t>
-            </w:r>
-            <w:r>
-              <w:rPr>
-                <w:rFonts w:ascii="Times New Roman" w:hAnsi="Times New Roman" w:cs="Times New Roman"/>
-                <w:i/>
-                <w:iCs/>
-                <w:color w:val="7030A0"/>
-                <w:sz w:val="24"/>
-                <w:szCs w:val="24"/>
-              </w:rPr>
-              <w:t>Module 12 Video/Reading Quiz</w:t>
-            </w:r>
-            <w:r>
-              <w:rPr>
-                <w:rFonts w:ascii="Times New Roman" w:hAnsi="Times New Roman" w:cs="Times New Roman"/>
-                <w:i/>
-                <w:iCs/>
-                <w:color w:val="7030A0"/>
-                <w:sz w:val="24"/>
-                <w:szCs w:val="24"/>
-              </w:rPr>
-              <w:t>)</w:t>
+                <w:rFonts w:ascii="Times New Roman" w:eastAsia="Times New Roman" w:hAnsi="Times New Roman" w:cs="Times New Roman"/>
+                <w:color w:val="0070C0"/>
+                <w:sz w:val="24"/>
+                <w:szCs w:val="24"/>
+              </w:rPr>
+            </w:pPr>
+            <w:r>
+              <w:rPr>
+                <w:rFonts w:ascii="Times New Roman" w:eastAsia="Times New Roman" w:hAnsi="Times New Roman" w:cs="Times New Roman"/>
+                <w:color w:val="0070C0"/>
+                <w:sz w:val="24"/>
+                <w:szCs w:val="24"/>
+              </w:rPr>
+              <w:t>Module 11</w:t>
+            </w:r>
+            <w:r>
+              <w:rPr>
+                <w:rFonts w:ascii="Times New Roman" w:eastAsia="Times New Roman" w:hAnsi="Times New Roman" w:cs="Times New Roman"/>
+                <w:color w:val="0070C0"/>
+                <w:sz w:val="24"/>
+                <w:szCs w:val="24"/>
+              </w:rPr>
+              <w:t xml:space="preserve"> Lab</w:t>
             </w:r>
           </w:p>
           <w:p>
@@ -7666,15 +6998,7 @@
                 <w:sz w:val="24"/>
                 <w:szCs w:val="24"/>
               </w:rPr>
-              <w:t>Mon 11/</w:t>
-            </w:r>
-            <w:r>
-              <w:rPr>
-                <w:rFonts w:ascii="Times New Roman" w:eastAsia="Times New Roman" w:hAnsi="Times New Roman" w:cs="Times New Roman"/>
-                <w:sz w:val="24"/>
-                <w:szCs w:val="24"/>
-              </w:rPr>
-              <w:t>9</w:t>
+              <w:t>Mon 11/9</w:t>
             </w:r>
           </w:p>
         </w:tc>
@@ -7702,18 +7026,11 @@
             <w:r>
               <w:rPr>
                 <w:rFonts w:ascii="Times New Roman" w:hAnsi="Times New Roman" w:cs="Times New Roman"/>
-                <w:sz w:val="24"/>
-                <w:szCs w:val="24"/>
-              </w:rPr>
-              <w:t xml:space="preserve">Activity 20: </w:t>
-            </w:r>
-            <w:r>
-              <w:rPr>
-                <w:rFonts w:ascii="Times New Roman" w:hAnsi="Times New Roman" w:cs="Times New Roman"/>
-                <w:sz w:val="24"/>
-                <w:szCs w:val="24"/>
-              </w:rPr>
-              <w:t>Penguins</w:t>
+                <w:iCs/>
+                <w:sz w:val="24"/>
+                <w:szCs w:val="24"/>
+              </w:rPr>
+              <w:t>Activity 19: IPEDS (continued) – Linear Regression</w:t>
             </w:r>
           </w:p>
         </w:tc>
@@ -7736,6 +7053,58 @@
                 <w:szCs w:val="24"/>
               </w:rPr>
             </w:pPr>
+            <w:r>
+              <w:rPr>
+                <w:rFonts w:ascii="Times New Roman" w:eastAsia="Times New Roman" w:hAnsi="Times New Roman" w:cs="Times New Roman"/>
+                <w:color w:val="FF0000"/>
+                <w:sz w:val="24"/>
+              </w:rPr>
+              <w:t xml:space="preserve">Ch 6; Ch 7; Ch 8; </w:t>
+            </w:r>
+            <w:r>
+              <w:rPr>
+                <w:rFonts w:ascii="Times New Roman" w:eastAsia="Times New Roman" w:hAnsi="Times New Roman" w:cs="Times New Roman"/>
+                <w:color w:val="FF0000"/>
+                <w:sz w:val="24"/>
+              </w:rPr>
+              <w:t>Ch 21; Ch 22</w:t>
+            </w:r>
+          </w:p>
+          <w:p>
+            <w:pPr>
+              <w:rPr>
+                <w:rFonts w:ascii="Times New Roman" w:eastAsia="Times New Roman" w:hAnsi="Times New Roman" w:cs="Times New Roman"/>
+                <w:color w:val="FF0000"/>
+                <w:sz w:val="24"/>
+              </w:rPr>
+            </w:pPr>
+            <w:r>
+              <w:rPr>
+                <w:rFonts w:ascii="Times New Roman" w:hAnsi="Times New Roman" w:cs="Times New Roman"/>
+                <w:color w:val="00B050"/>
+                <w:sz w:val="24"/>
+              </w:rPr>
+              <w:t>6.1, 6.2, 6.3, Ch 7, Ch21_Overview, 21.1, 21.3, 21.4TheoryTests, 21.4TheoryIntervals</w:t>
+            </w:r>
+          </w:p>
+          <w:p>
+            <w:pPr>
+              <w:rPr>
+                <w:rFonts w:ascii="Times New Roman" w:hAnsi="Times New Roman" w:cs="Times New Roman"/>
+                <w:color w:val="FF0000"/>
+                <w:sz w:val="24"/>
+                <w:szCs w:val="24"/>
+              </w:rPr>
+            </w:pPr>
+            <w:r>
+              <w:rPr>
+                <w:rFonts w:ascii="Times New Roman" w:hAnsi="Times New Roman" w:cs="Times New Roman"/>
+                <w:color w:val="4472C4" w:themeColor="accent5"/>
+                <w:sz w:val="24"/>
+                <w:szCs w:val="24"/>
+              </w:rPr>
+              <w:t>P. 281 - 298</w:t>
+            </w:r>
           </w:p>
         </w:tc>
         <w:tc>
@@ -7748,6 +7117,29 @@
               <w:right w:val="single" w:sz="4" w:space="0" w:color="000000"/>
             </w:tcBorders>
           </w:tcPr>
+          <w:p>
+            <w:pPr>
+              <w:rPr>
+                <w:rFonts w:ascii="Times New Roman" w:hAnsi="Times New Roman" w:cs="Times New Roman"/>
+                <w:i/>
+                <w:iCs/>
+                <w:color w:val="7030A0"/>
+                <w:sz w:val="24"/>
+                <w:szCs w:val="24"/>
+              </w:rPr>
+            </w:pPr>
+            <w:r>
+              <w:rPr>
+                <w:rFonts w:ascii="Times New Roman" w:hAnsi="Times New Roman" w:cs="Times New Roman"/>
+                <w:i/>
+                <w:iCs/>
+                <w:color w:val="7030A0"/>
+                <w:sz w:val="24"/>
+                <w:szCs w:val="24"/>
+              </w:rPr>
+              <w:t>Optional (Module 12 Video/Reading Quiz)</w:t>
+            </w:r>
+          </w:p>
           <w:p>
             <w:pPr>
               <w:rPr>
@@ -7844,16 +7236,7 @@
                 <w:sz w:val="24"/>
                 <w:szCs w:val="24"/>
               </w:rPr>
-              <w:t>11/</w:t>
-            </w:r>
-            <w:r>
-              <w:rPr>
-                <w:rFonts w:ascii="Times New Roman" w:hAnsi="Times New Roman" w:cs="Times New Roman"/>
-                <w:bCs/>
-                <w:sz w:val="24"/>
-                <w:szCs w:val="24"/>
-              </w:rPr>
-              <w:t>11</w:t>
+              <w:t>11/11</w:t>
             </w:r>
           </w:p>
         </w:tc>
@@ -8007,15 +7390,7 @@
                 <w:sz w:val="24"/>
                 <w:szCs w:val="24"/>
               </w:rPr>
-              <w:t>Fri 11/</w:t>
-            </w:r>
-            <w:r>
-              <w:rPr>
-                <w:rFonts w:ascii="Times New Roman" w:hAnsi="Times New Roman" w:cs="Times New Roman"/>
-                <w:sz w:val="24"/>
-                <w:szCs w:val="24"/>
-              </w:rPr>
-              <w:t>13</w:t>
+              <w:t>Fri 11/13</w:t>
             </w:r>
           </w:p>
         </w:tc>
@@ -8041,14 +7416,16 @@
             <w:r>
               <w:rPr>
                 <w:rFonts w:ascii="Times New Roman" w:hAnsi="Times New Roman" w:cs="Times New Roman"/>
-                <w:sz w:val="24"/>
-                <w:szCs w:val="24"/>
-              </w:rPr>
-              <w:t>Activity 21: Golf Driving Distance</w:t>
-            </w:r>
-            <w:r>
-              <w:rPr>
-                <w:rFonts w:ascii="Times New Roman" w:hAnsi="Times New Roman" w:cs="Times New Roman"/>
+                <w:iCs/>
+                <w:sz w:val="24"/>
+                <w:szCs w:val="24"/>
+              </w:rPr>
+              <w:t>Activity 22 Paired vs. Independent Samples</w:t>
+            </w:r>
+            <w:r>
+              <w:rPr>
+                <w:rFonts w:ascii="Times New Roman" w:hAnsi="Times New Roman" w:cs="Times New Roman"/>
+                <w:iCs/>
                 <w:sz w:val="24"/>
                 <w:szCs w:val="24"/>
               </w:rPr>
@@ -8170,15 +7547,7 @@
                 <w:sz w:val="24"/>
                 <w:szCs w:val="24"/>
               </w:rPr>
-              <w:t>Mon 11/1</w:t>
-            </w:r>
-            <w:r>
-              <w:rPr>
-                <w:rFonts w:ascii="Times New Roman" w:eastAsia="Times New Roman" w:hAnsi="Times New Roman" w:cs="Times New Roman"/>
-                <w:sz w:val="24"/>
-                <w:szCs w:val="24"/>
-              </w:rPr>
-              <w:t>6</w:t>
+              <w:t>Mon 11/16</w:t>
             </w:r>
           </w:p>
         </w:tc>
@@ -8205,10 +7574,21 @@
             <w:r>
               <w:rPr>
                 <w:rFonts w:ascii="Times New Roman" w:hAnsi="Times New Roman" w:cs="Times New Roman"/>
-                <w:sz w:val="24"/>
-                <w:szCs w:val="24"/>
-              </w:rPr>
-              <w:t>Module 12 Lab: Big Mac Index</w:t>
+                <w:iCs/>
+                <w:sz w:val="24"/>
+                <w:szCs w:val="24"/>
+              </w:rPr>
+              <w:t>Activity 23: Color Interference</w:t>
+            </w:r>
+            <w:r>
+              <w:rPr>
+                <w:rFonts w:ascii="Times New Roman" w:eastAsia="Times New Roman" w:hAnsi="Times New Roman" w:cs="Times New Roman"/>
+                <w:iCs/>
+                <w:color w:val="auto"/>
+                <w:sz w:val="24"/>
+                <w:szCs w:val="24"/>
+              </w:rPr>
+              <w:t xml:space="preserve"> </w:t>
             </w:r>
           </w:p>
         </w:tc>
@@ -8243,34 +7623,6 @@
               <w:right w:val="single" w:sz="4" w:space="0" w:color="000000"/>
             </w:tcBorders>
           </w:tcPr>
-          <w:p>
-            <w:pPr>
-              <w:rPr>
-                <w:rFonts w:ascii="Times New Roman" w:hAnsi="Times New Roman" w:cs="Times New Roman"/>
-                <w:color w:val="00B050"/>
-                <w:sz w:val="24"/>
-                <w:szCs w:val="24"/>
-              </w:rPr>
-            </w:pPr>
-            <w:r>
-              <w:rPr>
-                <w:rFonts w:ascii="Times New Roman" w:hAnsi="Times New Roman" w:cs="Times New Roman"/>
-                <w:color w:val="4472C4" w:themeColor="accent5"/>
-                <w:sz w:val="24"/>
-                <w:szCs w:val="24"/>
-              </w:rPr>
-              <w:t>Module 12 Lab</w:t>
-            </w:r>
-            <w:r>
-              <w:rPr>
-                <w:rFonts w:ascii="Times New Roman" w:hAnsi="Times New Roman" w:cs="Times New Roman"/>
-                <w:color w:val="00B050"/>
-                <w:sz w:val="24"/>
-                <w:szCs w:val="24"/>
-              </w:rPr>
-              <w:t xml:space="preserve">  </w:t>
-            </w:r>
-          </w:p>
           <w:p>
             <w:pPr>
               <w:rPr>
@@ -8391,12 +7743,13 @@
             </w:pPr>
             <w:r>
               <w:rPr>
-                <w:rFonts w:ascii="Times New Roman" w:hAnsi="Times New Roman" w:cs="Times New Roman"/>
+                <w:rFonts w:ascii="Times New Roman" w:eastAsia="Times New Roman" w:hAnsi="Times New Roman" w:cs="Times New Roman"/>
                 <w:iCs/>
-                <w:sz w:val="24"/>
-                <w:szCs w:val="24"/>
-              </w:rPr>
-              <w:t>Activity 22 Paired vs. Independent Samples</w:t>
+                <w:color w:val="auto"/>
+                <w:sz w:val="24"/>
+                <w:szCs w:val="24"/>
+              </w:rPr>
+              <w:t>Module 13 Lab: Swearing</w:t>
             </w:r>
           </w:p>
         </w:tc>
@@ -8413,110 +7766,68 @@
           <w:p>
             <w:pPr>
               <w:rPr>
-                <w:rFonts w:ascii="Times New Roman" w:eastAsia="Times New Roman" w:hAnsi="Times New Roman" w:cs="Times New Roman"/>
-                <w:color w:val="FF0000"/>
-                <w:sz w:val="24"/>
-              </w:rPr>
-            </w:pPr>
-            <w:r>
-              <w:rPr>
-                <w:rFonts w:ascii="Times New Roman" w:eastAsia="Times New Roman" w:hAnsi="Times New Roman" w:cs="Times New Roman"/>
-                <w:color w:val="FF0000"/>
-                <w:sz w:val="24"/>
-              </w:rPr>
-              <w:t>Ch 17; Ch 18</w:t>
-            </w:r>
-          </w:p>
+                <w:rFonts w:ascii="Times New Roman" w:hAnsi="Times New Roman" w:cs="Times New Roman"/>
+                <w:sz w:val="24"/>
+                <w:szCs w:val="24"/>
+              </w:rPr>
+            </w:pPr>
+          </w:p>
+        </w:tc>
+        <w:tc>
+          <w:tcPr>
+            <w:tcW w:w="2344" w:type="dxa"/>
+            <w:tcBorders>
+              <w:top w:val="single" w:sz="4" w:space="0" w:color="000000"/>
+              <w:left w:val="single" w:sz="4" w:space="0" w:color="000000"/>
+              <w:bottom w:val="single" w:sz="4" w:space="0" w:color="000000"/>
+              <w:right w:val="single" w:sz="4" w:space="0" w:color="000000"/>
+            </w:tcBorders>
+          </w:tcPr>
           <w:p>
             <w:pPr>
               <w:rPr>
                 <w:rFonts w:ascii="Times New Roman" w:hAnsi="Times New Roman" w:cs="Times New Roman"/>
                 <w:color w:val="00B050"/>
                 <w:sz w:val="24"/>
-              </w:rPr>
-            </w:pPr>
-            <w:proofErr w:type="spellStart"/>
+                <w:szCs w:val="24"/>
+              </w:rPr>
+            </w:pPr>
+            <w:r>
+              <w:rPr>
+                <w:rFonts w:ascii="Times New Roman" w:hAnsi="Times New Roman" w:cs="Times New Roman"/>
+                <w:color w:val="4472C4" w:themeColor="accent5"/>
+                <w:sz w:val="24"/>
+                <w:szCs w:val="24"/>
+              </w:rPr>
+              <w:t>Module 1</w:t>
+            </w:r>
+            <w:r>
+              <w:rPr>
+                <w:rFonts w:ascii="Times New Roman" w:hAnsi="Times New Roman" w:cs="Times New Roman"/>
+                <w:color w:val="4472C4" w:themeColor="accent5"/>
+                <w:sz w:val="24"/>
+                <w:szCs w:val="24"/>
+              </w:rPr>
+              <w:t xml:space="preserve">2 </w:t>
+            </w:r>
+            <w:r>
+              <w:rPr>
+                <w:rFonts w:ascii="Times New Roman" w:hAnsi="Times New Roman" w:cs="Times New Roman"/>
+                <w:color w:val="4472C4" w:themeColor="accent5"/>
+                <w:sz w:val="24"/>
+                <w:szCs w:val="24"/>
+              </w:rPr>
+              <w:t>Lab</w:t>
+            </w:r>
             <w:r>
               <w:rPr>
                 <w:rFonts w:ascii="Times New Roman" w:hAnsi="Times New Roman" w:cs="Times New Roman"/>
                 <w:color w:val="00B050"/>
                 <w:sz w:val="24"/>
-              </w:rPr>
-              <w:t>PairedData</w:t>
-            </w:r>
-            <w:proofErr w:type="spellEnd"/>
-            <w:r>
-              <w:rPr>
-                <w:rFonts w:ascii="Times New Roman" w:hAnsi="Times New Roman" w:cs="Times New Roman"/>
-                <w:color w:val="00B050"/>
-                <w:sz w:val="24"/>
-              </w:rPr>
-              <w:t>, 18.1and18.2, 18.3</w:t>
-            </w:r>
-          </w:p>
-          <w:p>
-            <w:pPr>
-              <w:rPr>
-                <w:rFonts w:ascii="Times New Roman" w:hAnsi="Times New Roman" w:cs="Times New Roman"/>
-                <w:sz w:val="24"/>
-                <w:szCs w:val="24"/>
-              </w:rPr>
-            </w:pPr>
-            <w:r>
-              <w:rPr>
-                <w:rFonts w:ascii="Times New Roman" w:hAnsi="Times New Roman" w:cs="Times New Roman"/>
-                <w:color w:val="4472C4" w:themeColor="accent5"/>
-                <w:sz w:val="24"/>
-                <w:szCs w:val="24"/>
-              </w:rPr>
-              <w:t>P. 330 - 337</w:t>
-            </w:r>
-          </w:p>
-        </w:tc>
-        <w:tc>
-          <w:tcPr>
-            <w:tcW w:w="2344" w:type="dxa"/>
-            <w:tcBorders>
-              <w:top w:val="single" w:sz="4" w:space="0" w:color="000000"/>
-              <w:left w:val="single" w:sz="4" w:space="0" w:color="000000"/>
-              <w:bottom w:val="single" w:sz="4" w:space="0" w:color="000000"/>
-              <w:right w:val="single" w:sz="4" w:space="0" w:color="000000"/>
-            </w:tcBorders>
-          </w:tcPr>
-          <w:p>
-            <w:pPr>
-              <w:rPr>
-                <w:rFonts w:ascii="Times New Roman" w:hAnsi="Times New Roman" w:cs="Times New Roman"/>
-                <w:i/>
-                <w:iCs/>
-                <w:color w:val="7030A0"/>
-                <w:sz w:val="24"/>
-                <w:szCs w:val="24"/>
-              </w:rPr>
-            </w:pPr>
-            <w:r>
-              <w:rPr>
-                <w:rFonts w:ascii="Times New Roman" w:hAnsi="Times New Roman" w:cs="Times New Roman"/>
-                <w:i/>
-                <w:iCs/>
-                <w:color w:val="7030A0"/>
-                <w:sz w:val="24"/>
-                <w:szCs w:val="24"/>
-              </w:rPr>
-              <w:t>Optional (Module 13 Video/Reading Quiz)</w:t>
-            </w:r>
-          </w:p>
-          <w:p>
-            <w:pPr>
-              <w:rPr>
-                <w:rFonts w:ascii="Times New Roman" w:hAnsi="Times New Roman" w:cs="Times New Roman"/>
-                <w:i/>
-                <w:iCs/>
-                <w:color w:val="FF0000"/>
-                <w:sz w:val="24"/>
-                <w:szCs w:val="24"/>
-              </w:rPr>
-            </w:pPr>
+                <w:szCs w:val="24"/>
+              </w:rPr>
+              <w:t xml:space="preserve">  </w:t>
+            </w:r>
           </w:p>
           <w:p>
             <w:pPr>
@@ -8620,44 +7931,131 @@
             <w:r>
               <w:rPr>
                 <w:rFonts w:ascii="Times New Roman" w:hAnsi="Times New Roman" w:cs="Times New Roman"/>
+                <w:sz w:val="24"/>
+                <w:szCs w:val="24"/>
+              </w:rPr>
+              <w:t>Activity 20: Penguins</w:t>
+            </w:r>
+          </w:p>
+        </w:tc>
+        <w:tc>
+          <w:tcPr>
+            <w:tcW w:w="2340" w:type="dxa"/>
+            <w:tcBorders>
+              <w:top w:val="single" w:sz="4" w:space="0" w:color="000000"/>
+              <w:left w:val="single" w:sz="4" w:space="0" w:color="000000"/>
+              <w:bottom w:val="double" w:sz="4" w:space="0" w:color="auto"/>
+              <w:right w:val="single" w:sz="4" w:space="0" w:color="000000"/>
+            </w:tcBorders>
+          </w:tcPr>
+          <w:p>
+            <w:pPr>
+              <w:rPr>
+                <w:rFonts w:ascii="Times New Roman" w:eastAsia="Times New Roman" w:hAnsi="Times New Roman" w:cs="Times New Roman"/>
+                <w:color w:val="FF0000"/>
+                <w:sz w:val="24"/>
+              </w:rPr>
+            </w:pPr>
+            <w:r>
+              <w:rPr>
+                <w:rFonts w:ascii="Times New Roman" w:eastAsia="Times New Roman" w:hAnsi="Times New Roman" w:cs="Times New Roman"/>
+                <w:color w:val="FF0000"/>
+                <w:sz w:val="24"/>
+              </w:rPr>
+              <w:t>Ch 17; Ch 18</w:t>
+            </w:r>
+          </w:p>
+          <w:p>
+            <w:pPr>
+              <w:rPr>
+                <w:rFonts w:ascii="Times New Roman" w:hAnsi="Times New Roman" w:cs="Times New Roman"/>
+                <w:color w:val="00B050"/>
+                <w:sz w:val="24"/>
+              </w:rPr>
+            </w:pPr>
+            <w:proofErr w:type="spellStart"/>
+            <w:r>
+              <w:rPr>
+                <w:rFonts w:ascii="Times New Roman" w:hAnsi="Times New Roman" w:cs="Times New Roman"/>
+                <w:color w:val="00B050"/>
+                <w:sz w:val="24"/>
+              </w:rPr>
+              <w:t>PairedData</w:t>
+            </w:r>
+            <w:proofErr w:type="spellEnd"/>
+            <w:r>
+              <w:rPr>
+                <w:rFonts w:ascii="Times New Roman" w:hAnsi="Times New Roman" w:cs="Times New Roman"/>
+                <w:color w:val="00B050"/>
+                <w:sz w:val="24"/>
+              </w:rPr>
+              <w:t>, 18.1and18.2, 18.3</w:t>
+            </w:r>
+          </w:p>
+          <w:p>
+            <w:pPr>
+              <w:rPr>
+                <w:rFonts w:ascii="Times New Roman" w:hAnsi="Times New Roman" w:cs="Times New Roman"/>
+                <w:sz w:val="24"/>
+                <w:szCs w:val="24"/>
+              </w:rPr>
+            </w:pPr>
+            <w:r>
+              <w:rPr>
+                <w:rFonts w:ascii="Times New Roman" w:hAnsi="Times New Roman" w:cs="Times New Roman"/>
+                <w:color w:val="4472C4" w:themeColor="accent5"/>
+                <w:sz w:val="24"/>
+                <w:szCs w:val="24"/>
+              </w:rPr>
+              <w:t>P. 330 - 337</w:t>
+            </w:r>
+          </w:p>
+        </w:tc>
+        <w:tc>
+          <w:tcPr>
+            <w:tcW w:w="2344" w:type="dxa"/>
+            <w:tcBorders>
+              <w:top w:val="single" w:sz="4" w:space="0" w:color="000000"/>
+              <w:left w:val="single" w:sz="4" w:space="0" w:color="000000"/>
+              <w:bottom w:val="double" w:sz="4" w:space="0" w:color="auto"/>
+              <w:right w:val="single" w:sz="4" w:space="0" w:color="000000"/>
+            </w:tcBorders>
+          </w:tcPr>
+          <w:p>
+            <w:pPr>
+              <w:rPr>
+                <w:rFonts w:ascii="Times New Roman" w:hAnsi="Times New Roman" w:cs="Times New Roman"/>
+                <w:i/>
                 <w:iCs/>
-                <w:sz w:val="24"/>
-                <w:szCs w:val="24"/>
-              </w:rPr>
-              <w:t>Activity 23: Color Interference</w:t>
-            </w:r>
-          </w:p>
-        </w:tc>
-        <w:tc>
-          <w:tcPr>
-            <w:tcW w:w="2340" w:type="dxa"/>
-            <w:tcBorders>
-              <w:top w:val="single" w:sz="4" w:space="0" w:color="000000"/>
-              <w:left w:val="single" w:sz="4" w:space="0" w:color="000000"/>
-              <w:bottom w:val="double" w:sz="4" w:space="0" w:color="auto"/>
-              <w:right w:val="single" w:sz="4" w:space="0" w:color="000000"/>
-            </w:tcBorders>
-          </w:tcPr>
-          <w:p>
-            <w:pPr>
-              <w:rPr>
-                <w:rFonts w:ascii="Times New Roman" w:hAnsi="Times New Roman" w:cs="Times New Roman"/>
-                <w:sz w:val="24"/>
-                <w:szCs w:val="24"/>
-              </w:rPr>
-            </w:pPr>
-          </w:p>
-        </w:tc>
-        <w:tc>
-          <w:tcPr>
-            <w:tcW w:w="2344" w:type="dxa"/>
-            <w:tcBorders>
-              <w:top w:val="single" w:sz="4" w:space="0" w:color="000000"/>
-              <w:left w:val="single" w:sz="4" w:space="0" w:color="000000"/>
-              <w:bottom w:val="double" w:sz="4" w:space="0" w:color="auto"/>
-              <w:right w:val="single" w:sz="4" w:space="0" w:color="000000"/>
-            </w:tcBorders>
-          </w:tcPr>
+                <w:color w:val="7030A0"/>
+                <w:sz w:val="24"/>
+                <w:szCs w:val="24"/>
+              </w:rPr>
+            </w:pPr>
+            <w:r>
+              <w:rPr>
+                <w:rFonts w:ascii="Times New Roman" w:hAnsi="Times New Roman" w:cs="Times New Roman"/>
+                <w:i/>
+                <w:iCs/>
+                <w:color w:val="7030A0"/>
+                <w:sz w:val="24"/>
+                <w:szCs w:val="24"/>
+              </w:rPr>
+              <w:t>Optional (Module 13 Video/Reading Quiz)</w:t>
+            </w:r>
+          </w:p>
+          <w:p>
+            <w:pPr>
+              <w:rPr>
+                <w:rFonts w:ascii="Times New Roman" w:hAnsi="Times New Roman" w:cs="Times New Roman"/>
+                <w:i/>
+                <w:iCs/>
+                <w:color w:val="FF0000"/>
+                <w:sz w:val="24"/>
+                <w:szCs w:val="24"/>
+              </w:rPr>
+            </w:pPr>
+          </w:p>
           <w:p>
             <w:pPr>
               <w:rPr>
@@ -8893,13 +8291,11 @@
             </w:pPr>
             <w:r>
               <w:rPr>
-                <w:rFonts w:ascii="Times New Roman" w:eastAsia="Times New Roman" w:hAnsi="Times New Roman" w:cs="Times New Roman"/>
-                <w:iCs/>
-                <w:color w:val="auto"/>
-                <w:sz w:val="24"/>
-                <w:szCs w:val="24"/>
-              </w:rPr>
-              <w:t>Module 13 Lab: Swearing</w:t>
+                <w:rFonts w:ascii="Times New Roman" w:hAnsi="Times New Roman" w:cs="Times New Roman"/>
+                <w:sz w:val="24"/>
+                <w:szCs w:val="24"/>
+              </w:rPr>
+              <w:t>Activity 21: Golf Driving Distance</w:t>
             </w:r>
           </w:p>
         </w:tc>
@@ -8933,34 +8329,6 @@
               <w:right w:val="single" w:sz="4" w:space="0" w:color="000000"/>
             </w:tcBorders>
           </w:tcPr>
-          <w:p>
-            <w:pPr>
-              <w:rPr>
-                <w:rFonts w:ascii="Times New Roman" w:hAnsi="Times New Roman" w:cs="Times New Roman"/>
-                <w:color w:val="00B050"/>
-                <w:sz w:val="24"/>
-                <w:szCs w:val="24"/>
-              </w:rPr>
-            </w:pPr>
-            <w:r>
-              <w:rPr>
-                <w:rFonts w:ascii="Times New Roman" w:eastAsia="Times New Roman" w:hAnsi="Times New Roman" w:cs="Times New Roman"/>
-                <w:color w:val="0070C0"/>
-                <w:sz w:val="24"/>
-                <w:szCs w:val="24"/>
-              </w:rPr>
-              <w:t>Module 13</w:t>
-            </w:r>
-            <w:r>
-              <w:rPr>
-                <w:rFonts w:ascii="Times New Roman" w:eastAsia="Times New Roman" w:hAnsi="Times New Roman" w:cs="Times New Roman"/>
-                <w:color w:val="0070C0"/>
-                <w:sz w:val="24"/>
-                <w:szCs w:val="24"/>
-              </w:rPr>
-              <w:t xml:space="preserve"> Lab</w:t>
-            </w:r>
-          </w:p>
           <w:p>
             <w:pPr>
               <w:rPr>
@@ -9045,15 +8413,7 @@
                 <w:sz w:val="24"/>
                 <w:szCs w:val="24"/>
               </w:rPr>
-              <w:t>Wed 12/</w:t>
-            </w:r>
-            <w:r>
-              <w:rPr>
-                <w:rFonts w:ascii="Times New Roman" w:hAnsi="Times New Roman" w:cs="Times New Roman"/>
-                <w:sz w:val="24"/>
-                <w:szCs w:val="24"/>
-              </w:rPr>
-              <w:t>2</w:t>
+              <w:t>Wed 12/2</w:t>
             </w:r>
           </w:p>
         </w:tc>
@@ -9082,7 +8442,7 @@
                 <w:sz w:val="24"/>
                 <w:szCs w:val="24"/>
               </w:rPr>
-              <w:t>Special Topics</w:t>
+              <w:t>Module 12 Lab: Big Mac Index</w:t>
             </w:r>
           </w:p>
         </w:tc>
@@ -9116,6 +8476,34 @@
               <w:right w:val="single" w:sz="4" w:space="0" w:color="000000"/>
             </w:tcBorders>
           </w:tcPr>
+          <w:p>
+            <w:pPr>
+              <w:rPr>
+                <w:rFonts w:ascii="Times New Roman" w:hAnsi="Times New Roman" w:cs="Times New Roman"/>
+                <w:color w:val="00B050"/>
+                <w:sz w:val="24"/>
+                <w:szCs w:val="24"/>
+              </w:rPr>
+            </w:pPr>
+            <w:r>
+              <w:rPr>
+                <w:rFonts w:ascii="Times New Roman" w:eastAsia="Times New Roman" w:hAnsi="Times New Roman" w:cs="Times New Roman"/>
+                <w:color w:val="0070C0"/>
+                <w:sz w:val="24"/>
+                <w:szCs w:val="24"/>
+              </w:rPr>
+              <w:t>Module 13</w:t>
+            </w:r>
+            <w:r>
+              <w:rPr>
+                <w:rFonts w:ascii="Times New Roman" w:eastAsia="Times New Roman" w:hAnsi="Times New Roman" w:cs="Times New Roman"/>
+                <w:color w:val="0070C0"/>
+                <w:sz w:val="24"/>
+                <w:szCs w:val="24"/>
+              </w:rPr>
+              <w:t xml:space="preserve"> Lab</w:t>
+            </w:r>
+          </w:p>
           <w:p>
             <w:pPr>
               <w:rPr>
@@ -9182,15 +8570,7 @@
                 <w:sz w:val="24"/>
                 <w:szCs w:val="24"/>
               </w:rPr>
-              <w:t>Fri 12/</w:t>
-            </w:r>
-            <w:r>
-              <w:rPr>
-                <w:rFonts w:ascii="Times New Roman" w:hAnsi="Times New Roman" w:cs="Times New Roman"/>
-                <w:sz w:val="24"/>
-                <w:szCs w:val="24"/>
-              </w:rPr>
-              <w:t>4</w:t>
+              <w:t>Fri 12/4</w:t>
             </w:r>
           </w:p>
         </w:tc>

</xml_diff>

<commit_message>
Fall 2026 Calendar Update
</commit_message>
<xml_diff>
--- a/calendars/F26-Stat216_Calendar.docx
+++ b/calendars/F26-Stat216_Calendar.docx
@@ -142,20 +142,8 @@
           <w:sz w:val="24"/>
           <w:szCs w:val="24"/>
         </w:rPr>
-        <w:t xml:space="preserve"> </w:t>
+        <w:t xml:space="preserve"> Gradescope</w:t>
       </w:r>
-      <w:proofErr w:type="spellStart"/>
-      <w:r>
-        <w:rPr>
-          <w:rFonts w:ascii="Times New Roman" w:hAnsi="Times New Roman" w:cs="Times New Roman"/>
-          <w:i/>
-          <w:iCs/>
-          <w:sz w:val="24"/>
-          <w:szCs w:val="24"/>
-        </w:rPr>
-        <w:t>Gradescope</w:t>
-      </w:r>
-      <w:proofErr w:type="spellEnd"/>
     </w:p>
     <w:p>
       <w:pPr>
@@ -212,18 +200,8 @@
           <w:sz w:val="24"/>
           <w:szCs w:val="24"/>
         </w:rPr>
-        <w:t xml:space="preserve"> due at the beginning of </w:t>
+        <w:t xml:space="preserve"> due at the beginning of class</w:t>
       </w:r>
-      <w:proofErr w:type="gramStart"/>
-      <w:r>
-        <w:rPr>
-          <w:rFonts w:ascii="Times New Roman" w:eastAsia="Times New Roman" w:hAnsi="Times New Roman" w:cs="Times New Roman"/>
-          <w:sz w:val="24"/>
-          <w:szCs w:val="24"/>
-        </w:rPr>
-        <w:t>class</w:t>
-      </w:r>
-      <w:proofErr w:type="gramEnd"/>
       <w:r>
         <w:rPr>
           <w:rFonts w:ascii="Times New Roman" w:eastAsia="Times New Roman" w:hAnsi="Times New Roman" w:cs="Times New Roman"/>
@@ -1156,7 +1134,6 @@
                 <w:highlight w:val="yellow"/>
               </w:rPr>
             </w:pPr>
-            <w:proofErr w:type="gramStart"/>
             <w:r>
               <w:rPr>
                 <w:rFonts w:ascii="Times New Roman" w:hAnsi="Times New Roman" w:cs="Times New Roman"/>
@@ -1165,18 +1142,7 @@
                 <w:szCs w:val="24"/>
                 <w:highlight w:val="yellow"/>
               </w:rPr>
-              <w:t>1.2</w:t>
-            </w:r>
-            <w:proofErr w:type="gramEnd"/>
-            <w:r>
-              <w:rPr>
-                <w:rFonts w:ascii="Times New Roman" w:hAnsi="Times New Roman" w:cs="Times New Roman"/>
-                <w:color w:val="00B050"/>
-                <w:sz w:val="24"/>
-                <w:szCs w:val="24"/>
-                <w:highlight w:val="yellow"/>
-              </w:rPr>
-              <w:t>.1and1.2.2, 2.1</w:t>
+              <w:t>1.2.1and1.2.2, 2.1</w:t>
             </w:r>
             <w:r>
               <w:rPr>
@@ -4899,19 +4865,8 @@
                 <w:sz w:val="24"/>
                 <w:szCs w:val="24"/>
               </w:rPr>
-              <w:t xml:space="preserve"> 2.2to2.4, 4.1_TwoProp, 4.2_TwoProp, 4.4, 15.1, 15.2, </w:t>
-            </w:r>
-            <w:proofErr w:type="spellStart"/>
-            <w:r>
-              <w:rPr>
-                <w:rFonts w:ascii="Times New Roman" w:hAnsi="Times New Roman" w:cs="Times New Roman"/>
-                <w:color w:val="00B050"/>
-                <w:sz w:val="24"/>
-                <w:szCs w:val="24"/>
-              </w:rPr>
-              <w:t>RelativeRisk</w:t>
-            </w:r>
-            <w:proofErr w:type="spellEnd"/>
+              <w:t xml:space="preserve"> 2.2to2.4, 4.1_TwoProp, 4.2_TwoProp, 4.4, 15.1, 15.2, RelativeRisk</w:t>
+            </w:r>
           </w:p>
           <w:p>
             <w:pPr>
@@ -7420,7 +7375,7 @@
                 <w:sz w:val="24"/>
                 <w:szCs w:val="24"/>
               </w:rPr>
-              <w:t>Activity 22 Paired vs. Independent Samples</w:t>
+              <w:t>Activity 2</w:t>
             </w:r>
             <w:r>
               <w:rPr>
@@ -7429,7 +7384,16 @@
                 <w:sz w:val="24"/>
                 <w:szCs w:val="24"/>
               </w:rPr>
-              <w:t xml:space="preserve"> </w:t>
+              <w:t>0</w:t>
+            </w:r>
+            <w:r>
+              <w:rPr>
+                <w:rFonts w:ascii="Times New Roman" w:hAnsi="Times New Roman" w:cs="Times New Roman"/>
+                <w:iCs/>
+                <w:sz w:val="24"/>
+                <w:szCs w:val="24"/>
+              </w:rPr>
+              <w:t xml:space="preserve"> Paired vs. Independent Samples </w:t>
             </w:r>
           </w:p>
         </w:tc>
@@ -7578,7 +7542,25 @@
                 <w:sz w:val="24"/>
                 <w:szCs w:val="24"/>
               </w:rPr>
-              <w:t>Activity 23: Color Interference</w:t>
+              <w:t xml:space="preserve">Activity </w:t>
+            </w:r>
+            <w:r>
+              <w:rPr>
+                <w:rFonts w:ascii="Times New Roman" w:hAnsi="Times New Roman" w:cs="Times New Roman"/>
+                <w:iCs/>
+                <w:sz w:val="24"/>
+                <w:szCs w:val="24"/>
+              </w:rPr>
+              <w:t>21</w:t>
+            </w:r>
+            <w:r>
+              <w:rPr>
+                <w:rFonts w:ascii="Times New Roman" w:hAnsi="Times New Roman" w:cs="Times New Roman"/>
+                <w:iCs/>
+                <w:sz w:val="24"/>
+                <w:szCs w:val="24"/>
+              </w:rPr>
+              <w:t>: Color Interference</w:t>
             </w:r>
             <w:r>
               <w:rPr>
@@ -7749,7 +7731,27 @@
                 <w:sz w:val="24"/>
                 <w:szCs w:val="24"/>
               </w:rPr>
-              <w:t>Module 13 Lab: Swearing</w:t>
+              <w:t>Module 1</w:t>
+            </w:r>
+            <w:r>
+              <w:rPr>
+                <w:rFonts w:ascii="Times New Roman" w:eastAsia="Times New Roman" w:hAnsi="Times New Roman" w:cs="Times New Roman"/>
+                <w:iCs/>
+                <w:color w:val="auto"/>
+                <w:sz w:val="24"/>
+                <w:szCs w:val="24"/>
+              </w:rPr>
+              <w:t>2</w:t>
+            </w:r>
+            <w:r>
+              <w:rPr>
+                <w:rFonts w:ascii="Times New Roman" w:eastAsia="Times New Roman" w:hAnsi="Times New Roman" w:cs="Times New Roman"/>
+                <w:iCs/>
+                <w:color w:val="auto"/>
+                <w:sz w:val="24"/>
+                <w:szCs w:val="24"/>
+              </w:rPr>
+              <w:t xml:space="preserve"> Lab: Swearing</w:t>
             </w:r>
           </w:p>
         </w:tc>
@@ -7934,7 +7936,23 @@
                 <w:sz w:val="24"/>
                 <w:szCs w:val="24"/>
               </w:rPr>
-              <w:t>Activity 20: Penguins</w:t>
+              <w:t>Activity 2</w:t>
+            </w:r>
+            <w:r>
+              <w:rPr>
+                <w:rFonts w:ascii="Times New Roman" w:hAnsi="Times New Roman" w:cs="Times New Roman"/>
+                <w:sz w:val="24"/>
+                <w:szCs w:val="24"/>
+              </w:rPr>
+              <w:t>2</w:t>
+            </w:r>
+            <w:r>
+              <w:rPr>
+                <w:rFonts w:ascii="Times New Roman" w:hAnsi="Times New Roman" w:cs="Times New Roman"/>
+                <w:sz w:val="24"/>
+                <w:szCs w:val="24"/>
+              </w:rPr>
+              <w:t>: Penguins</w:t>
             </w:r>
           </w:p>
         </w:tc>
@@ -7973,23 +7991,13 @@
                 <w:sz w:val="24"/>
               </w:rPr>
             </w:pPr>
-            <w:proofErr w:type="spellStart"/>
             <w:r>
               <w:rPr>
                 <w:rFonts w:ascii="Times New Roman" w:hAnsi="Times New Roman" w:cs="Times New Roman"/>
                 <w:color w:val="00B050"/>
                 <w:sz w:val="24"/>
               </w:rPr>
-              <w:t>PairedData</w:t>
-            </w:r>
-            <w:proofErr w:type="spellEnd"/>
-            <w:r>
-              <w:rPr>
-                <w:rFonts w:ascii="Times New Roman" w:hAnsi="Times New Roman" w:cs="Times New Roman"/>
-                <w:color w:val="00B050"/>
-                <w:sz w:val="24"/>
-              </w:rPr>
-              <w:t>, 18.1and18.2, 18.3</w:t>
+              <w:t>PairedData, 18.1and18.2, 18.3</w:t>
             </w:r>
           </w:p>
           <w:p>
@@ -8295,7 +8303,23 @@
                 <w:sz w:val="24"/>
                 <w:szCs w:val="24"/>
               </w:rPr>
-              <w:t>Activity 21: Golf Driving Distance</w:t>
+              <w:t>Activity 2</w:t>
+            </w:r>
+            <w:r>
+              <w:rPr>
+                <w:rFonts w:ascii="Times New Roman" w:hAnsi="Times New Roman" w:cs="Times New Roman"/>
+                <w:sz w:val="24"/>
+                <w:szCs w:val="24"/>
+              </w:rPr>
+              <w:t>3</w:t>
+            </w:r>
+            <w:r>
+              <w:rPr>
+                <w:rFonts w:ascii="Times New Roman" w:hAnsi="Times New Roman" w:cs="Times New Roman"/>
+                <w:sz w:val="24"/>
+                <w:szCs w:val="24"/>
+              </w:rPr>
+              <w:t>: Golf Driving Distance</w:t>
             </w:r>
           </w:p>
         </w:tc>
@@ -8442,7 +8466,23 @@
                 <w:sz w:val="24"/>
                 <w:szCs w:val="24"/>
               </w:rPr>
-              <w:t>Module 12 Lab: Big Mac Index</w:t>
+              <w:t>Module 1</w:t>
+            </w:r>
+            <w:r>
+              <w:rPr>
+                <w:rFonts w:ascii="Times New Roman" w:hAnsi="Times New Roman" w:cs="Times New Roman"/>
+                <w:sz w:val="24"/>
+                <w:szCs w:val="24"/>
+              </w:rPr>
+              <w:t>3</w:t>
+            </w:r>
+            <w:r>
+              <w:rPr>
+                <w:rFonts w:ascii="Times New Roman" w:hAnsi="Times New Roman" w:cs="Times New Roman"/>
+                <w:sz w:val="24"/>
+                <w:szCs w:val="24"/>
+              </w:rPr>
+              <w:t xml:space="preserve"> Lab: Big Mac Index</w:t>
             </w:r>
           </w:p>
         </w:tc>
@@ -8715,15 +8755,7 @@
                 <w:sz w:val="24"/>
                 <w:szCs w:val="24"/>
               </w:rPr>
-              <w:t xml:space="preserve">Mon </w:t>
-            </w:r>
-            <w:r>
-              <w:rPr>
-                <w:rFonts w:ascii="Times New Roman" w:hAnsi="Times New Roman" w:cs="Times New Roman"/>
-                <w:sz w:val="24"/>
-                <w:szCs w:val="24"/>
-              </w:rPr>
-              <w:t>12/7</w:t>
+              <w:t>Mon 12/7</w:t>
             </w:r>
           </w:p>
         </w:tc>
@@ -8872,15 +8904,7 @@
                 <w:sz w:val="24"/>
                 <w:szCs w:val="24"/>
               </w:rPr>
-              <w:t xml:space="preserve">Wed </w:t>
-            </w:r>
-            <w:r>
-              <w:rPr>
-                <w:rFonts w:ascii="Times New Roman" w:hAnsi="Times New Roman" w:cs="Times New Roman"/>
-                <w:sz w:val="24"/>
-                <w:szCs w:val="24"/>
-              </w:rPr>
-              <w:t>12/9</w:t>
+              <w:t>Wed 12/9</w:t>
             </w:r>
           </w:p>
         </w:tc>
@@ -9013,15 +9037,7 @@
                 <w:sz w:val="24"/>
                 <w:szCs w:val="24"/>
               </w:rPr>
-              <w:t xml:space="preserve">Fri </w:t>
-            </w:r>
-            <w:r>
-              <w:rPr>
-                <w:rFonts w:ascii="Times New Roman" w:hAnsi="Times New Roman" w:cs="Times New Roman"/>
-                <w:sz w:val="24"/>
-                <w:szCs w:val="24"/>
-              </w:rPr>
-              <w:t>12/11</w:t>
+              <w:t>Fri 12/11</w:t>
             </w:r>
           </w:p>
         </w:tc>
@@ -10598,6 +10614,21 @@
 </file>
 
 <file path=customXml/item1.xml><?xml version="1.0" encoding="utf-8"?>
+<p:properties xmlns:p="http://schemas.microsoft.com/office/2006/metadata/properties" xmlns:xsi="http://www.w3.org/2001/XMLSchema-instance" xmlns:pc="http://schemas.microsoft.com/office/infopath/2007/PartnerControls">
+  <documentManagement/>
+</p:properties>
+</file>
+
+<file path=customXml/item2.xml><?xml version="1.0" encoding="utf-8"?>
+<?mso-contentType ?>
+<FormTemplates xmlns="http://schemas.microsoft.com/sharepoint/v3/contenttype/forms">
+  <Display>DocumentLibraryForm</Display>
+  <Edit>DocumentLibraryForm</Edit>
+  <New>DocumentLibraryForm</New>
+</FormTemplates>
+</file>
+
+<file path=customXml/item3.xml><?xml version="1.0" encoding="utf-8"?>
 <ct:contentTypeSchema xmlns:ct="http://schemas.microsoft.com/office/2006/metadata/contentType" xmlns:ma="http://schemas.microsoft.com/office/2006/metadata/properties/metaAttributes" ct:_="" ma:_="" ma:contentTypeName="Document" ma:contentTypeID="0x010100CC03F583B8FC7D479BB917DCC50A759A" ma:contentTypeVersion="2" ma:contentTypeDescription="Create a new document." ma:contentTypeScope="" ma:versionID="a416b87cb6da220f553d25b31c6d1561">
   <xsd:schema xmlns:xsd="http://www.w3.org/2001/XMLSchema" xmlns:xs="http://www.w3.org/2001/XMLSchema" xmlns:p="http://schemas.microsoft.com/office/2006/metadata/properties" xmlns:ns2="7a494ea9-5c76-4b6d-9fd1-0b14ddec65d9" targetNamespace="http://schemas.microsoft.com/office/2006/metadata/properties" ma:root="true" ma:fieldsID="5848f5ec45c4ce39acac4a9febeb8d96" ns2:_="">
     <xsd:import namespace="7a494ea9-5c76-4b6d-9fd1-0b14ddec65d9"/>
@@ -10729,22 +10760,24 @@
 </ct:contentTypeSchema>
 </file>
 
-<file path=customXml/item2.xml><?xml version="1.0" encoding="utf-8"?>
-<?mso-contentType ?>
-<FormTemplates xmlns="http://schemas.microsoft.com/sharepoint/v3/contenttype/forms">
-  <Display>DocumentLibraryForm</Display>
-  <Edit>DocumentLibraryForm</Edit>
-  <New>DocumentLibraryForm</New>
-</FormTemplates>
+<file path=customXml/itemProps1.xml><?xml version="1.0" encoding="utf-8"?>
+<ds:datastoreItem xmlns:ds="http://schemas.openxmlformats.org/officeDocument/2006/customXml" ds:itemID="{36ACC8F3-6E63-4670-B73D-DE1280E8DB8D}">
+  <ds:schemaRefs>
+    <ds:schemaRef ds:uri="http://schemas.microsoft.com/office/2006/metadata/properties"/>
+    <ds:schemaRef ds:uri="http://schemas.microsoft.com/office/infopath/2007/PartnerControls"/>
+  </ds:schemaRefs>
+</ds:datastoreItem>
 </file>
 
-<file path=customXml/item3.xml><?xml version="1.0" encoding="utf-8"?>
-<p:properties xmlns:p="http://schemas.microsoft.com/office/2006/metadata/properties" xmlns:xsi="http://www.w3.org/2001/XMLSchema-instance" xmlns:pc="http://schemas.microsoft.com/office/infopath/2007/PartnerControls">
-  <documentManagement/>
-</p:properties>
+<file path=customXml/itemProps2.xml><?xml version="1.0" encoding="utf-8"?>
+<ds:datastoreItem xmlns:ds="http://schemas.openxmlformats.org/officeDocument/2006/customXml" ds:itemID="{73898C2B-C96D-434F-A1B6-6069F656FA6D}">
+  <ds:schemaRefs>
+    <ds:schemaRef ds:uri="http://schemas.microsoft.com/sharepoint/v3/contenttype/forms"/>
+  </ds:schemaRefs>
+</ds:datastoreItem>
 </file>
 
-<file path=customXml/itemProps1.xml><?xml version="1.0" encoding="utf-8"?>
+<file path=customXml/itemProps3.xml><?xml version="1.0" encoding="utf-8"?>
 <ds:datastoreItem xmlns:ds="http://schemas.openxmlformats.org/officeDocument/2006/customXml" ds:itemID="{F5239868-B096-4B81-8FD1-0516D39E2D56}">
   <ds:schemaRefs>
     <ds:schemaRef ds:uri="http://schemas.microsoft.com/office/2006/metadata/contentType"/>
@@ -10760,21 +10793,4 @@
     <ds:schemaRef ds:uri="http://schemas.microsoft.com/internal/obd"/>
   </ds:schemaRefs>
 </ds:datastoreItem>
-</file>
-
-<file path=customXml/itemProps2.xml><?xml version="1.0" encoding="utf-8"?>
-<ds:datastoreItem xmlns:ds="http://schemas.openxmlformats.org/officeDocument/2006/customXml" ds:itemID="{73898C2B-C96D-434F-A1B6-6069F656FA6D}">
-  <ds:schemaRefs>
-    <ds:schemaRef ds:uri="http://schemas.microsoft.com/sharepoint/v3/contenttype/forms"/>
-  </ds:schemaRefs>
-</ds:datastoreItem>
-</file>
-
-<file path=customXml/itemProps3.xml><?xml version="1.0" encoding="utf-8"?>
-<ds:datastoreItem xmlns:ds="http://schemas.openxmlformats.org/officeDocument/2006/customXml" ds:itemID="{36ACC8F3-6E63-4670-B73D-DE1280E8DB8D}">
-  <ds:schemaRefs>
-    <ds:schemaRef ds:uri="http://schemas.microsoft.com/office/2006/metadata/properties"/>
-    <ds:schemaRef ds:uri="http://schemas.microsoft.com/office/infopath/2007/PartnerControls"/>
-  </ds:schemaRefs>
-</ds:datastoreItem>
 </file>
</xml_diff>